<commit_message>
turn off draft more for storymap_my_journey
</commit_message>
<xml_diff>
--- a/docs/posts/storymap_my_journey/index.docx
+++ b/docs/posts/storymap_my_journey/index.docx
@@ -291,6 +291,1520 @@
       </w:pPr>
       <w:r>
         <w:t xml:space="preserve">The storymap application follows a typical Shiny structure with some specialized {mapgl} components. Following is the source code for this dashboard (Please click on the numbers on the far right for additional explanation of syntax and mechanics):</w:t>
+      </w:r>
+    </w:p>
+    <w:p>
+      <w:pPr>
+        <w:pStyle w:val="SourceCode"/>
+      </w:pPr>
+      <w:r>
+        <w:rPr>
+          <w:rStyle w:val="VerbatimChar"/>
+        </w:rPr>
+        <w:t xml:space="preserve">  [1] "library(shiny) # &lt;1&gt;"                                                                            </w:t>
+      </w:r>
+      <w:r>
+        <w:br/>
+      </w:r>
+      <w:r>
+        <w:rPr>
+          <w:rStyle w:val="VerbatimChar"/>
+        </w:rPr>
+        <w:t xml:space="preserve">  [2] "library(mapgl) # &lt;2&gt;"                                                                            </w:t>
+      </w:r>
+      <w:r>
+        <w:br/>
+      </w:r>
+      <w:r>
+        <w:rPr>
+          <w:rStyle w:val="VerbatimChar"/>
+        </w:rPr>
+        <w:t xml:space="preserve">  [3] ""                                                                                                </w:t>
+      </w:r>
+      <w:r>
+        <w:br/>
+      </w:r>
+      <w:r>
+        <w:rPr>
+          <w:rStyle w:val="VerbatimChar"/>
+        </w:rPr>
+        <w:t xml:space="preserve">  [4] "ui &lt;- shiny::fluidPage( # &lt;3&gt;"                                                                   </w:t>
+      </w:r>
+      <w:r>
+        <w:br/>
+      </w:r>
+      <w:r>
+        <w:rPr>
+          <w:rStyle w:val="VerbatimChar"/>
+        </w:rPr>
+        <w:t xml:space="preserve">  [5] "  tags$link("                                                                                    </w:t>
+      </w:r>
+      <w:r>
+        <w:br/>
+      </w:r>
+      <w:r>
+        <w:rPr>
+          <w:rStyle w:val="VerbatimChar"/>
+        </w:rPr>
+        <w:t xml:space="preserve">  [6] "    href = \"https://fonts.googleapis.com/css2?family=Poppins:wght@300;400;600&amp;display=swap\","  </w:t>
+      </w:r>
+      <w:r>
+        <w:br/>
+      </w:r>
+      <w:r>
+        <w:rPr>
+          <w:rStyle w:val="VerbatimChar"/>
+        </w:rPr>
+        <w:t xml:space="preserve">  [7] "    rel=\"stylesheet\""                                                                          </w:t>
+      </w:r>
+      <w:r>
+        <w:br/>
+      </w:r>
+      <w:r>
+        <w:rPr>
+          <w:rStyle w:val="VerbatimChar"/>
+        </w:rPr>
+        <w:t xml:space="preserve">  [8] "  ),"                                                                                            </w:t>
+      </w:r>
+      <w:r>
+        <w:br/>
+      </w:r>
+      <w:r>
+        <w:rPr>
+          <w:rStyle w:val="VerbatimChar"/>
+        </w:rPr>
+        <w:t xml:space="preserve">  [9] "  mapgl::story_map( # &lt;4&gt;"                                                                       </w:t>
+      </w:r>
+      <w:r>
+        <w:br/>
+      </w:r>
+      <w:r>
+        <w:rPr>
+          <w:rStyle w:val="VerbatimChar"/>
+        </w:rPr>
+        <w:t xml:space="preserve"> [10] "    map_id = \"map\","                                                                           </w:t>
+      </w:r>
+      <w:r>
+        <w:br/>
+      </w:r>
+      <w:r>
+        <w:rPr>
+          <w:rStyle w:val="VerbatimChar"/>
+        </w:rPr>
+        <w:t xml:space="preserve"> [11] "    font_family = \"Poppins\","                                                                  </w:t>
+      </w:r>
+      <w:r>
+        <w:br/>
+      </w:r>
+      <w:r>
+        <w:rPr>
+          <w:rStyle w:val="VerbatimChar"/>
+        </w:rPr>
+        <w:t xml:space="preserve"> [12] "    sections = list( # &lt;5&gt;"                                                                      </w:t>
+      </w:r>
+      <w:r>
+        <w:br/>
+      </w:r>
+      <w:r>
+        <w:rPr>
+          <w:rStyle w:val="VerbatimChar"/>
+        </w:rPr>
+        <w:t xml:space="preserve"> [13] "      \"intro\" = mapgl::story_section("                                                         </w:t>
+      </w:r>
+      <w:r>
+        <w:br/>
+      </w:r>
+      <w:r>
+        <w:rPr>
+          <w:rStyle w:val="VerbatimChar"/>
+        </w:rPr>
+        <w:t xml:space="preserve"> [14] "        title = \"Introduction\","                                                               </w:t>
+      </w:r>
+      <w:r>
+        <w:br/>
+      </w:r>
+      <w:r>
+        <w:rPr>
+          <w:rStyle w:val="VerbatimChar"/>
+        </w:rPr>
+        <w:t xml:space="preserve"> [15] "        content = \"Hello I am Pukar Bhandari; and this is my life journey.\""                   </w:t>
+      </w:r>
+      <w:r>
+        <w:br/>
+      </w:r>
+      <w:r>
+        <w:rPr>
+          <w:rStyle w:val="VerbatimChar"/>
+        </w:rPr>
+        <w:t xml:space="preserve"> [16] "      ),"                                                                                        </w:t>
+      </w:r>
+      <w:r>
+        <w:br/>
+      </w:r>
+      <w:r>
+        <w:rPr>
+          <w:rStyle w:val="VerbatimChar"/>
+        </w:rPr>
+        <w:t xml:space="preserve"> [17] "      \"birth_place\" = mapgl::story_section("                                                   </w:t>
+      </w:r>
+      <w:r>
+        <w:br/>
+      </w:r>
+      <w:r>
+        <w:rPr>
+          <w:rStyle w:val="VerbatimChar"/>
+        </w:rPr>
+        <w:t xml:space="preserve"> [18] "        title = \"Birth Place\","                                                                </w:t>
+      </w:r>
+      <w:r>
+        <w:br/>
+      </w:r>
+      <w:r>
+        <w:rPr>
+          <w:rStyle w:val="VerbatimChar"/>
+        </w:rPr>
+        <w:t xml:space="preserve"> [19] "        content = \"This is where I was born.\""                                                 </w:t>
+      </w:r>
+      <w:r>
+        <w:br/>
+      </w:r>
+      <w:r>
+        <w:rPr>
+          <w:rStyle w:val="VerbatimChar"/>
+        </w:rPr>
+        <w:t xml:space="preserve"> [20] "      ),"                                                                                        </w:t>
+      </w:r>
+      <w:r>
+        <w:br/>
+      </w:r>
+      <w:r>
+        <w:rPr>
+          <w:rStyle w:val="VerbatimChar"/>
+        </w:rPr>
+        <w:t xml:space="preserve"> [21] "      \"lower_primary\" = mapgl::story_section("                                                 </w:t>
+      </w:r>
+      <w:r>
+        <w:br/>
+      </w:r>
+      <w:r>
+        <w:rPr>
+          <w:rStyle w:val="VerbatimChar"/>
+        </w:rPr>
+        <w:t xml:space="preserve"> [22] "        title = \"Kankai Education Foundation\","                                                </w:t>
+      </w:r>
+      <w:r>
+        <w:br/>
+      </w:r>
+      <w:r>
+        <w:rPr>
+          <w:rStyle w:val="VerbatimChar"/>
+        </w:rPr>
+        <w:t xml:space="preserve"> [23] "        content = \"This is where I studied Nursery to Grade 3.\""                               </w:t>
+      </w:r>
+      <w:r>
+        <w:br/>
+      </w:r>
+      <w:r>
+        <w:rPr>
+          <w:rStyle w:val="VerbatimChar"/>
+        </w:rPr>
+        <w:t xml:space="preserve"> [24] "      ),"                                                                                        </w:t>
+      </w:r>
+      <w:r>
+        <w:br/>
+      </w:r>
+      <w:r>
+        <w:rPr>
+          <w:rStyle w:val="VerbatimChar"/>
+        </w:rPr>
+        <w:t xml:space="preserve"> [25] "      \"upper_primary\" = mapgl::story_section("                                                 </w:t>
+      </w:r>
+      <w:r>
+        <w:br/>
+      </w:r>
+      <w:r>
+        <w:rPr>
+          <w:rStyle w:val="VerbatimChar"/>
+        </w:rPr>
+        <w:t xml:space="preserve"> [26] "        title = \"Laligurans English School\","                                                  </w:t>
+      </w:r>
+      <w:r>
+        <w:br/>
+      </w:r>
+      <w:r>
+        <w:rPr>
+          <w:rStyle w:val="VerbatimChar"/>
+        </w:rPr>
+        <w:t xml:space="preserve"> [27] "        content = \"This is where I studied Grade 4 &amp; Grade 5.\""                                </w:t>
+      </w:r>
+      <w:r>
+        <w:br/>
+      </w:r>
+      <w:r>
+        <w:rPr>
+          <w:rStyle w:val="VerbatimChar"/>
+        </w:rPr>
+        <w:t xml:space="preserve"> [28] "      ),"                                                                                        </w:t>
+      </w:r>
+      <w:r>
+        <w:br/>
+      </w:r>
+      <w:r>
+        <w:rPr>
+          <w:rStyle w:val="VerbatimChar"/>
+        </w:rPr>
+        <w:t xml:space="preserve"> [29] "      \"middle_school\" = mapgl::story_section("                                                 </w:t>
+      </w:r>
+      <w:r>
+        <w:br/>
+      </w:r>
+      <w:r>
+        <w:rPr>
+          <w:rStyle w:val="VerbatimChar"/>
+        </w:rPr>
+        <w:t xml:space="preserve"> [30] "        title = \"Birat Jyoti English Secondary School\","                                       </w:t>
+      </w:r>
+      <w:r>
+        <w:br/>
+      </w:r>
+      <w:r>
+        <w:rPr>
+          <w:rStyle w:val="VerbatimChar"/>
+        </w:rPr>
+        <w:t xml:space="preserve"> [31] "        content = \"This is where I studied Grade 6 &amp; Grade 7.\""                                </w:t>
+      </w:r>
+      <w:r>
+        <w:br/>
+      </w:r>
+      <w:r>
+        <w:rPr>
+          <w:rStyle w:val="VerbatimChar"/>
+        </w:rPr>
+        <w:t xml:space="preserve"> [32] "      ),"                                                                                        </w:t>
+      </w:r>
+      <w:r>
+        <w:br/>
+      </w:r>
+      <w:r>
+        <w:rPr>
+          <w:rStyle w:val="VerbatimChar"/>
+        </w:rPr>
+        <w:t xml:space="preserve"> [33] "      \"secondary_school\" = mapgl::story_section("                                              </w:t>
+      </w:r>
+      <w:r>
+        <w:br/>
+      </w:r>
+      <w:r>
+        <w:rPr>
+          <w:rStyle w:val="VerbatimChar"/>
+        </w:rPr>
+        <w:t xml:space="preserve"> [34] "        title = \"Little Flowers' English School\","                                             </w:t>
+      </w:r>
+      <w:r>
+        <w:br/>
+      </w:r>
+      <w:r>
+        <w:rPr>
+          <w:rStyle w:val="VerbatimChar"/>
+        </w:rPr>
+        <w:t xml:space="preserve"> [35] "        content = \"This is where I studied Grade 8 to Grade 10.\""                              </w:t>
+      </w:r>
+      <w:r>
+        <w:br/>
+      </w:r>
+      <w:r>
+        <w:rPr>
+          <w:rStyle w:val="VerbatimChar"/>
+        </w:rPr>
+        <w:t xml:space="preserve"> [36] "      ),"                                                                                        </w:t>
+      </w:r>
+      <w:r>
+        <w:br/>
+      </w:r>
+      <w:r>
+        <w:rPr>
+          <w:rStyle w:val="VerbatimChar"/>
+        </w:rPr>
+        <w:t xml:space="preserve"> [37] "      \"higher_secondary\" = mapgl::story_section("                                              </w:t>
+      </w:r>
+      <w:r>
+        <w:br/>
+      </w:r>
+      <w:r>
+        <w:rPr>
+          <w:rStyle w:val="VerbatimChar"/>
+        </w:rPr>
+        <w:t xml:space="preserve"> [38] "        title = \"Kanchanjunga English Higher Secondary School\","                               </w:t>
+      </w:r>
+      <w:r>
+        <w:br/>
+      </w:r>
+      <w:r>
+        <w:rPr>
+          <w:rStyle w:val="VerbatimChar"/>
+        </w:rPr>
+        <w:t xml:space="preserve"> [39] "        content = \"This is where I studied Higher Secondary (Plus 2).\""                        </w:t>
+      </w:r>
+      <w:r>
+        <w:br/>
+      </w:r>
+      <w:r>
+        <w:rPr>
+          <w:rStyle w:val="VerbatimChar"/>
+        </w:rPr>
+        <w:t xml:space="preserve"> [40] "      ),"                                                                                        </w:t>
+      </w:r>
+      <w:r>
+        <w:br/>
+      </w:r>
+      <w:r>
+        <w:rPr>
+          <w:rStyle w:val="VerbatimChar"/>
+        </w:rPr>
+        <w:t xml:space="preserve"> [41] "      \"bachelors\" = mapgl::story_section("                                                     </w:t>
+      </w:r>
+      <w:r>
+        <w:br/>
+      </w:r>
+      <w:r>
+        <w:rPr>
+          <w:rStyle w:val="VerbatimChar"/>
+        </w:rPr>
+        <w:t xml:space="preserve"> [42] "        title = \"Institute of Engineering Pulchowk Campus\","                                   </w:t>
+      </w:r>
+      <w:r>
+        <w:br/>
+      </w:r>
+      <w:r>
+        <w:rPr>
+          <w:rStyle w:val="VerbatimChar"/>
+        </w:rPr>
+        <w:t xml:space="preserve"> [43] "        content = \"This is where I obtained my Bachelor's Degree in Architecture.\""            </w:t>
+      </w:r>
+      <w:r>
+        <w:br/>
+      </w:r>
+      <w:r>
+        <w:rPr>
+          <w:rStyle w:val="VerbatimChar"/>
+        </w:rPr>
+        <w:t xml:space="preserve"> [44] "      ),"                                                                                        </w:t>
+      </w:r>
+      <w:r>
+        <w:br/>
+      </w:r>
+      <w:r>
+        <w:rPr>
+          <w:rStyle w:val="VerbatimChar"/>
+        </w:rPr>
+        <w:t xml:space="preserve"> [45] "      \"masters\" = mapgl::story_section("                                                       </w:t>
+      </w:r>
+      <w:r>
+        <w:br/>
+      </w:r>
+      <w:r>
+        <w:rPr>
+          <w:rStyle w:val="VerbatimChar"/>
+        </w:rPr>
+        <w:t xml:space="preserve"> [46] "        title = \"University of Utah\","                                                         </w:t>
+      </w:r>
+      <w:r>
+        <w:br/>
+      </w:r>
+      <w:r>
+        <w:rPr>
+          <w:rStyle w:val="VerbatimChar"/>
+        </w:rPr>
+        <w:t xml:space="preserve"> [47] "        content = \"This is where I obtained my Master of City &amp; Metropolitan Planning degree.\""</w:t>
+      </w:r>
+      <w:r>
+        <w:br/>
+      </w:r>
+      <w:r>
+        <w:rPr>
+          <w:rStyle w:val="VerbatimChar"/>
+        </w:rPr>
+        <w:t xml:space="preserve"> [48] "      ),"                                                                                        </w:t>
+      </w:r>
+      <w:r>
+        <w:br/>
+      </w:r>
+      <w:r>
+        <w:rPr>
+          <w:rStyle w:val="VerbatimChar"/>
+        </w:rPr>
+        <w:t xml:space="preserve"> [49] "      \"work_1\" = mapgl::story_section("                                                        </w:t>
+      </w:r>
+      <w:r>
+        <w:br/>
+      </w:r>
+      <w:r>
+        <w:rPr>
+          <w:rStyle w:val="VerbatimChar"/>
+        </w:rPr>
+        <w:t xml:space="preserve"> [50] "        title = \"Metro Analytics\","                                                            </w:t>
+      </w:r>
+      <w:r>
+        <w:br/>
+      </w:r>
+      <w:r>
+        <w:rPr>
+          <w:rStyle w:val="VerbatimChar"/>
+        </w:rPr>
+        <w:t xml:space="preserve"> [51] "        content = \"This is where I lived and worked between 2023-2025.\""                       </w:t>
+      </w:r>
+      <w:r>
+        <w:br/>
+      </w:r>
+      <w:r>
+        <w:rPr>
+          <w:rStyle w:val="VerbatimChar"/>
+        </w:rPr>
+        <w:t xml:space="preserve"> [52] "      ),"                                                                                        </w:t>
+      </w:r>
+      <w:r>
+        <w:br/>
+      </w:r>
+      <w:r>
+        <w:rPr>
+          <w:rStyle w:val="VerbatimChar"/>
+        </w:rPr>
+        <w:t xml:space="preserve"> [53] "      \"work_2\" = mapgl::story_section("                                                        </w:t>
+      </w:r>
+      <w:r>
+        <w:br/>
+      </w:r>
+      <w:r>
+        <w:rPr>
+          <w:rStyle w:val="VerbatimChar"/>
+        </w:rPr>
+        <w:t xml:space="preserve"> [54] "        title = \"Wasatch Front Regional Council\","                                             </w:t>
+      </w:r>
+      <w:r>
+        <w:br/>
+      </w:r>
+      <w:r>
+        <w:rPr>
+          <w:rStyle w:val="VerbatimChar"/>
+        </w:rPr>
+        <w:t xml:space="preserve"> [55] "        content = \"This is where I live and work currently.\""                                  </w:t>
+      </w:r>
+      <w:r>
+        <w:br/>
+      </w:r>
+      <w:r>
+        <w:rPr>
+          <w:rStyle w:val="VerbatimChar"/>
+        </w:rPr>
+        <w:t xml:space="preserve"> [56] "      )"                                                                                         </w:t>
+      </w:r>
+      <w:r>
+        <w:br/>
+      </w:r>
+      <w:r>
+        <w:rPr>
+          <w:rStyle w:val="VerbatimChar"/>
+        </w:rPr>
+        <w:t xml:space="preserve"> [57] "    ),"                                                                                          </w:t>
+      </w:r>
+      <w:r>
+        <w:br/>
+      </w:r>
+      <w:r>
+        <w:rPr>
+          <w:rStyle w:val="VerbatimChar"/>
+        </w:rPr>
+        <w:t xml:space="preserve"> [58] "    map_type = \"maplibre\""                                                                     </w:t>
+      </w:r>
+      <w:r>
+        <w:br/>
+      </w:r>
+      <w:r>
+        <w:rPr>
+          <w:rStyle w:val="VerbatimChar"/>
+        </w:rPr>
+        <w:t xml:space="preserve"> [59] "  )"                                                                                             </w:t>
+      </w:r>
+      <w:r>
+        <w:br/>
+      </w:r>
+      <w:r>
+        <w:rPr>
+          <w:rStyle w:val="VerbatimChar"/>
+        </w:rPr>
+        <w:t xml:space="preserve"> [60] ")"                                                                                               </w:t>
+      </w:r>
+      <w:r>
+        <w:br/>
+      </w:r>
+      <w:r>
+        <w:rPr>
+          <w:rStyle w:val="VerbatimChar"/>
+        </w:rPr>
+        <w:t xml:space="preserve"> [61] ""                                                                                                </w:t>
+      </w:r>
+      <w:r>
+        <w:br/>
+      </w:r>
+      <w:r>
+        <w:rPr>
+          <w:rStyle w:val="VerbatimChar"/>
+        </w:rPr>
+        <w:t xml:space="preserve"> [62] "server &lt;- function(input, output, session) { # &lt;6&gt;"                                              </w:t>
+      </w:r>
+      <w:r>
+        <w:br/>
+      </w:r>
+      <w:r>
+        <w:rPr>
+          <w:rStyle w:val="VerbatimChar"/>
+        </w:rPr>
+        <w:t xml:space="preserve"> [63] "  output$map &lt;- mapgl::renderMaplibre({ # &lt;7&gt;"                                                   </w:t>
+      </w:r>
+      <w:r>
+        <w:br/>
+      </w:r>
+      <w:r>
+        <w:rPr>
+          <w:rStyle w:val="VerbatimChar"/>
+        </w:rPr>
+        <w:t xml:space="preserve"> [64] "    mapgl::maplibre("                                                                            </w:t>
+      </w:r>
+      <w:r>
+        <w:br/>
+      </w:r>
+      <w:r>
+        <w:rPr>
+          <w:rStyle w:val="VerbatimChar"/>
+        </w:rPr>
+        <w:t xml:space="preserve"> [65] "      style = \"https://tiles.openfreemap.org/styles/liberty\", # &lt;8&gt;"                           </w:t>
+      </w:r>
+      <w:r>
+        <w:br/>
+      </w:r>
+      <w:r>
+        <w:rPr>
+          <w:rStyle w:val="VerbatimChar"/>
+        </w:rPr>
+        <w:t xml:space="preserve"> [66] "      center = c(0, 0),"                                                                         </w:t>
+      </w:r>
+      <w:r>
+        <w:br/>
+      </w:r>
+      <w:r>
+        <w:rPr>
+          <w:rStyle w:val="VerbatimChar"/>
+        </w:rPr>
+        <w:t xml:space="preserve"> [67] "      zoom = 2.75,"                                                                              </w:t>
+      </w:r>
+      <w:r>
+        <w:br/>
+      </w:r>
+      <w:r>
+        <w:rPr>
+          <w:rStyle w:val="VerbatimChar"/>
+        </w:rPr>
+        <w:t xml:space="preserve"> [68] "      scrollZoom = FALSE"                                                                        </w:t>
+      </w:r>
+      <w:r>
+        <w:br/>
+      </w:r>
+      <w:r>
+        <w:rPr>
+          <w:rStyle w:val="VerbatimChar"/>
+        </w:rPr>
+        <w:t xml:space="preserve"> [69] "    ) |&gt;"                                                                                        </w:t>
+      </w:r>
+      <w:r>
+        <w:br/>
+      </w:r>
+      <w:r>
+        <w:rPr>
+          <w:rStyle w:val="VerbatimChar"/>
+        </w:rPr>
+        <w:t xml:space="preserve"> [70] "      mapgl::set_projection(projection = \"globe\") |&gt; # &lt;9&gt;"                                    </w:t>
+      </w:r>
+      <w:r>
+        <w:br/>
+      </w:r>
+      <w:r>
+        <w:rPr>
+          <w:rStyle w:val="VerbatimChar"/>
+        </w:rPr>
+        <w:t xml:space="preserve"> [71] "      mapgl::add_globe_control() |&gt;"                                                             </w:t>
+      </w:r>
+      <w:r>
+        <w:br/>
+      </w:r>
+      <w:r>
+        <w:rPr>
+          <w:rStyle w:val="VerbatimChar"/>
+        </w:rPr>
+        <w:t xml:space="preserve"> [72] "      mapgl::add_navigation_control(visualize_pitch = TRUE) |&gt;"                                  </w:t>
+      </w:r>
+      <w:r>
+        <w:br/>
+      </w:r>
+      <w:r>
+        <w:rPr>
+          <w:rStyle w:val="VerbatimChar"/>
+        </w:rPr>
+        <w:t xml:space="preserve"> [73] "      mapgl::add_globe_minimap(position = \"bottom-left\")"                                      </w:t>
+      </w:r>
+      <w:r>
+        <w:br/>
+      </w:r>
+      <w:r>
+        <w:rPr>
+          <w:rStyle w:val="VerbatimChar"/>
+        </w:rPr>
+        <w:t xml:space="preserve"> [74] "  })"                                                                                            </w:t>
+      </w:r>
+      <w:r>
+        <w:br/>
+      </w:r>
+      <w:r>
+        <w:rPr>
+          <w:rStyle w:val="VerbatimChar"/>
+        </w:rPr>
+        <w:t xml:space="preserve"> [75] ""                                                                                                </w:t>
+      </w:r>
+      <w:r>
+        <w:br/>
+      </w:r>
+      <w:r>
+        <w:rPr>
+          <w:rStyle w:val="VerbatimChar"/>
+        </w:rPr>
+        <w:t xml:space="preserve"> [76] "  mapgl::on_section(\"map\", \"intro\", { # &lt;10&gt;"                                                </w:t>
+      </w:r>
+      <w:r>
+        <w:br/>
+      </w:r>
+      <w:r>
+        <w:rPr>
+          <w:rStyle w:val="VerbatimChar"/>
+        </w:rPr>
+        <w:t xml:space="preserve"> [77] "    mapgl::maplibre_proxy(\"map\") |&gt;"                                                           </w:t>
+      </w:r>
+      <w:r>
+        <w:br/>
+      </w:r>
+      <w:r>
+        <w:rPr>
+          <w:rStyle w:val="VerbatimChar"/>
+        </w:rPr>
+        <w:t xml:space="preserve"> [78] "      mapgl::clear_markers() |&gt;"                                                                 </w:t>
+      </w:r>
+      <w:r>
+        <w:br/>
+      </w:r>
+      <w:r>
+        <w:rPr>
+          <w:rStyle w:val="VerbatimChar"/>
+        </w:rPr>
+        <w:t xml:space="preserve"> [79] "      mapgl::fly_to("                                                                            </w:t>
+      </w:r>
+      <w:r>
+        <w:br/>
+      </w:r>
+      <w:r>
+        <w:rPr>
+          <w:rStyle w:val="VerbatimChar"/>
+        </w:rPr>
+        <w:t xml:space="preserve"> [80] "        center = c(0, 0),"                                                                       </w:t>
+      </w:r>
+      <w:r>
+        <w:br/>
+      </w:r>
+      <w:r>
+        <w:rPr>
+          <w:rStyle w:val="VerbatimChar"/>
+        </w:rPr>
+        <w:t xml:space="preserve"> [81] "        zoom = 2.75,"                                                                            </w:t>
+      </w:r>
+      <w:r>
+        <w:br/>
+      </w:r>
+      <w:r>
+        <w:rPr>
+          <w:rStyle w:val="VerbatimChar"/>
+        </w:rPr>
+        <w:t xml:space="preserve"> [82] "        pitch = 0,"                                                                              </w:t>
+      </w:r>
+      <w:r>
+        <w:br/>
+      </w:r>
+      <w:r>
+        <w:rPr>
+          <w:rStyle w:val="VerbatimChar"/>
+        </w:rPr>
+        <w:t xml:space="preserve"> [83] "        bearing = 0"                                                                             </w:t>
+      </w:r>
+      <w:r>
+        <w:br/>
+      </w:r>
+      <w:r>
+        <w:rPr>
+          <w:rStyle w:val="VerbatimChar"/>
+        </w:rPr>
+        <w:t xml:space="preserve"> [84] "      )"                                                                                         </w:t>
+      </w:r>
+      <w:r>
+        <w:br/>
+      </w:r>
+      <w:r>
+        <w:rPr>
+          <w:rStyle w:val="VerbatimChar"/>
+        </w:rPr>
+        <w:t xml:space="preserve"> [85] "  })"                                                                                            </w:t>
+      </w:r>
+      <w:r>
+        <w:br/>
+      </w:r>
+      <w:r>
+        <w:rPr>
+          <w:rStyle w:val="VerbatimChar"/>
+        </w:rPr>
+        <w:t xml:space="preserve"> [86] ""                                                                                                </w:t>
+      </w:r>
+      <w:r>
+        <w:br/>
+      </w:r>
+      <w:r>
+        <w:rPr>
+          <w:rStyle w:val="VerbatimChar"/>
+        </w:rPr>
+        <w:t xml:space="preserve"> [87] "  mapgl::on_section(\"map\", \"birth_place\", {"                                                 </w:t>
+      </w:r>
+      <w:r>
+        <w:br/>
+      </w:r>
+      <w:r>
+        <w:rPr>
+          <w:rStyle w:val="VerbatimChar"/>
+        </w:rPr>
+        <w:t xml:space="preserve"> [88] "    mapgl::maplibre_proxy(\"map\") |&gt;"                                                           </w:t>
+      </w:r>
+      <w:r>
+        <w:br/>
+      </w:r>
+      <w:r>
+        <w:rPr>
+          <w:rStyle w:val="VerbatimChar"/>
+        </w:rPr>
+        <w:t xml:space="preserve"> [89] "      mapgl::fly_to(center = c(87.99371750247397, 26.646533355308083),"                          </w:t>
+      </w:r>
+      <w:r>
+        <w:br/>
+      </w:r>
+      <w:r>
+        <w:rPr>
+          <w:rStyle w:val="VerbatimChar"/>
+        </w:rPr>
+        <w:t xml:space="preserve"> [90] "                    zoom = 16,"                                                                  </w:t>
+      </w:r>
+      <w:r>
+        <w:br/>
+      </w:r>
+      <w:r>
+        <w:rPr>
+          <w:rStyle w:val="VerbatimChar"/>
+        </w:rPr>
+        <w:t xml:space="preserve"> [91] "                    pitch = 49,"                                                                 </w:t>
+      </w:r>
+      <w:r>
+        <w:br/>
+      </w:r>
+      <w:r>
+        <w:rPr>
+          <w:rStyle w:val="VerbatimChar"/>
+        </w:rPr>
+        <w:t xml:space="preserve"> [92] "                    bearing = 12.8)"                                                             </w:t>
+      </w:r>
+      <w:r>
+        <w:br/>
+      </w:r>
+      <w:r>
+        <w:rPr>
+          <w:rStyle w:val="VerbatimChar"/>
+        </w:rPr>
+        <w:t xml:space="preserve"> [93] "  })"                                                                                            </w:t>
+      </w:r>
+      <w:r>
+        <w:br/>
+      </w:r>
+      <w:r>
+        <w:rPr>
+          <w:rStyle w:val="VerbatimChar"/>
+        </w:rPr>
+        <w:t xml:space="preserve"> [94] ""                                                                                                </w:t>
+      </w:r>
+      <w:r>
+        <w:br/>
+      </w:r>
+      <w:r>
+        <w:rPr>
+          <w:rStyle w:val="VerbatimChar"/>
+        </w:rPr>
+        <w:t xml:space="preserve"> [95] "  mapgl::on_section(\"map\", \"lower_primary\", {"                                               </w:t>
+      </w:r>
+      <w:r>
+        <w:br/>
+      </w:r>
+      <w:r>
+        <w:rPr>
+          <w:rStyle w:val="VerbatimChar"/>
+        </w:rPr>
+        <w:t xml:space="preserve"> [96] "    mapgl::maplibre_proxy(\"map\") |&gt;"                                                           </w:t>
+      </w:r>
+      <w:r>
+        <w:br/>
+      </w:r>
+      <w:r>
+        <w:rPr>
+          <w:rStyle w:val="VerbatimChar"/>
+        </w:rPr>
+        <w:t xml:space="preserve"> [97] "      mapgl::fly_to(center = c(87.99734666704784, 26.646179601882675),"                          </w:t>
+      </w:r>
+      <w:r>
+        <w:br/>
+      </w:r>
+      <w:r>
+        <w:rPr>
+          <w:rStyle w:val="VerbatimChar"/>
+        </w:rPr>
+        <w:t xml:space="preserve"> [98] "                    zoom = 16,"                                                                  </w:t>
+      </w:r>
+      <w:r>
+        <w:br/>
+      </w:r>
+      <w:r>
+        <w:rPr>
+          <w:rStyle w:val="VerbatimChar"/>
+        </w:rPr>
+        <w:t xml:space="preserve"> [99] "                    pitch = 49,"                                                                 </w:t>
+      </w:r>
+      <w:r>
+        <w:br/>
+      </w:r>
+      <w:r>
+        <w:rPr>
+          <w:rStyle w:val="VerbatimChar"/>
+        </w:rPr>
+        <w:t xml:space="preserve">[100] "                    bearing = 12.8)"                                                             </w:t>
+      </w:r>
+      <w:r>
+        <w:br/>
+      </w:r>
+      <w:r>
+        <w:rPr>
+          <w:rStyle w:val="VerbatimChar"/>
+        </w:rPr>
+        <w:t xml:space="preserve">[101] "  })"                                                                                            </w:t>
+      </w:r>
+      <w:r>
+        <w:br/>
+      </w:r>
+      <w:r>
+        <w:rPr>
+          <w:rStyle w:val="VerbatimChar"/>
+        </w:rPr>
+        <w:t xml:space="preserve">[102] ""                                                                                                </w:t>
+      </w:r>
+      <w:r>
+        <w:br/>
+      </w:r>
+      <w:r>
+        <w:rPr>
+          <w:rStyle w:val="VerbatimChar"/>
+        </w:rPr>
+        <w:t xml:space="preserve">[103] "  mapgl::on_section(\"map\", \"upper_primary\", {"                                               </w:t>
+      </w:r>
+      <w:r>
+        <w:br/>
+      </w:r>
+      <w:r>
+        <w:rPr>
+          <w:rStyle w:val="VerbatimChar"/>
+        </w:rPr>
+        <w:t xml:space="preserve">[104] "    mapgl::maplibre_proxy(\"map\") |&gt;"                                                           </w:t>
+      </w:r>
+      <w:r>
+        <w:br/>
+      </w:r>
+      <w:r>
+        <w:rPr>
+          <w:rStyle w:val="VerbatimChar"/>
+        </w:rPr>
+        <w:t xml:space="preserve">[105] "      mapgl::fly_to(center = c(88.01116125198942, 26.608294715049524),"                          </w:t>
+      </w:r>
+      <w:r>
+        <w:br/>
+      </w:r>
+      <w:r>
+        <w:rPr>
+          <w:rStyle w:val="VerbatimChar"/>
+        </w:rPr>
+        <w:t xml:space="preserve">[106] "                    zoom = 16,"                                                                  </w:t>
+      </w:r>
+      <w:r>
+        <w:br/>
+      </w:r>
+      <w:r>
+        <w:rPr>
+          <w:rStyle w:val="VerbatimChar"/>
+        </w:rPr>
+        <w:t xml:space="preserve">[107] "                    pitch = 49,"                                                                 </w:t>
+      </w:r>
+      <w:r>
+        <w:br/>
+      </w:r>
+      <w:r>
+        <w:rPr>
+          <w:rStyle w:val="VerbatimChar"/>
+        </w:rPr>
+        <w:t xml:space="preserve">[108] "                    bearing = 12.8)"                                                             </w:t>
+      </w:r>
+      <w:r>
+        <w:br/>
+      </w:r>
+      <w:r>
+        <w:rPr>
+          <w:rStyle w:val="VerbatimChar"/>
+        </w:rPr>
+        <w:t xml:space="preserve">[109] "  })"                                                                                            </w:t>
+      </w:r>
+      <w:r>
+        <w:br/>
+      </w:r>
+      <w:r>
+        <w:rPr>
+          <w:rStyle w:val="VerbatimChar"/>
+        </w:rPr>
+        <w:t xml:space="preserve">[110] ""                                                                                                </w:t>
+      </w:r>
+      <w:r>
+        <w:br/>
+      </w:r>
+      <w:r>
+        <w:rPr>
+          <w:rStyle w:val="VerbatimChar"/>
+        </w:rPr>
+        <w:t xml:space="preserve">[111] "  mapgl::on_section(\"map\", \"middle_school\", {"                                               </w:t>
+      </w:r>
+      <w:r>
+        <w:br/>
+      </w:r>
+      <w:r>
+        <w:rPr>
+          <w:rStyle w:val="VerbatimChar"/>
+        </w:rPr>
+        <w:t xml:space="preserve">[112] "    mapgl::maplibre_proxy(\"map\") |&gt;"                                                           </w:t>
+      </w:r>
+      <w:r>
+        <w:br/>
+      </w:r>
+      <w:r>
+        <w:rPr>
+          <w:rStyle w:val="VerbatimChar"/>
+        </w:rPr>
+        <w:t xml:space="preserve">[113] "      mapgl::fly_to(center = c(87.99218594227516, 26.620735015314324),"                          </w:t>
+      </w:r>
+      <w:r>
+        <w:br/>
+      </w:r>
+      <w:r>
+        <w:rPr>
+          <w:rStyle w:val="VerbatimChar"/>
+        </w:rPr>
+        <w:t xml:space="preserve">[114] "                    zoom = 16,"                                                                  </w:t>
+      </w:r>
+      <w:r>
+        <w:br/>
+      </w:r>
+      <w:r>
+        <w:rPr>
+          <w:rStyle w:val="VerbatimChar"/>
+        </w:rPr>
+        <w:t xml:space="preserve">[115] "                    pitch = 49,"                                                                 </w:t>
+      </w:r>
+      <w:r>
+        <w:br/>
+      </w:r>
+      <w:r>
+        <w:rPr>
+          <w:rStyle w:val="VerbatimChar"/>
+        </w:rPr>
+        <w:t xml:space="preserve">[116] "                    bearing = 12.8)"                                                             </w:t>
+      </w:r>
+      <w:r>
+        <w:br/>
+      </w:r>
+      <w:r>
+        <w:rPr>
+          <w:rStyle w:val="VerbatimChar"/>
+        </w:rPr>
+        <w:t xml:space="preserve">[117] "  })"                                                                                            </w:t>
+      </w:r>
+      <w:r>
+        <w:br/>
+      </w:r>
+      <w:r>
+        <w:rPr>
+          <w:rStyle w:val="VerbatimChar"/>
+        </w:rPr>
+        <w:t xml:space="preserve">[118] ""                                                                                                </w:t>
+      </w:r>
+      <w:r>
+        <w:br/>
+      </w:r>
+      <w:r>
+        <w:rPr>
+          <w:rStyle w:val="VerbatimChar"/>
+        </w:rPr>
+        <w:t xml:space="preserve">[119] "  mapgl::on_section(\"map\", \"secondary_school\", {"                                            </w:t>
+      </w:r>
+      <w:r>
+        <w:br/>
+      </w:r>
+      <w:r>
+        <w:rPr>
+          <w:rStyle w:val="VerbatimChar"/>
+        </w:rPr>
+        <w:t xml:space="preserve">[120] "    mapgl::maplibre_proxy(\"map\") |&gt;"                                                           </w:t>
+      </w:r>
+      <w:r>
+        <w:br/>
+      </w:r>
+      <w:r>
+        <w:rPr>
+          <w:rStyle w:val="VerbatimChar"/>
+        </w:rPr>
+        <w:t xml:space="preserve">[121] "      mapgl::fly_to(center = c(87.99006631463702, 26.63185913816036),"                           </w:t>
+      </w:r>
+      <w:r>
+        <w:br/>
+      </w:r>
+      <w:r>
+        <w:rPr>
+          <w:rStyle w:val="VerbatimChar"/>
+        </w:rPr>
+        <w:t xml:space="preserve">[122] "                    zoom = 16,"                                                                  </w:t>
+      </w:r>
+      <w:r>
+        <w:br/>
+      </w:r>
+      <w:r>
+        <w:rPr>
+          <w:rStyle w:val="VerbatimChar"/>
+        </w:rPr>
+        <w:t xml:space="preserve">[123] "                    pitch = 49,"                                                                 </w:t>
+      </w:r>
+      <w:r>
+        <w:br/>
+      </w:r>
+      <w:r>
+        <w:rPr>
+          <w:rStyle w:val="VerbatimChar"/>
+        </w:rPr>
+        <w:t xml:space="preserve">[124] "                    bearing = 12.8)"                                                             </w:t>
+      </w:r>
+      <w:r>
+        <w:br/>
+      </w:r>
+      <w:r>
+        <w:rPr>
+          <w:rStyle w:val="VerbatimChar"/>
+        </w:rPr>
+        <w:t xml:space="preserve">[125] "  })"                                                                                            </w:t>
+      </w:r>
+      <w:r>
+        <w:br/>
+      </w:r>
+      <w:r>
+        <w:rPr>
+          <w:rStyle w:val="VerbatimChar"/>
+        </w:rPr>
+        <w:t xml:space="preserve">[126] ""                                                                                                </w:t>
+      </w:r>
+      <w:r>
+        <w:br/>
+      </w:r>
+      <w:r>
+        <w:rPr>
+          <w:rStyle w:val="VerbatimChar"/>
+        </w:rPr>
+        <w:t xml:space="preserve">[127] "  mapgl::on_section(\"map\", \"higher_secondary\", {"                                            </w:t>
+      </w:r>
+      <w:r>
+        <w:br/>
+      </w:r>
+      <w:r>
+        <w:rPr>
+          <w:rStyle w:val="VerbatimChar"/>
+        </w:rPr>
+        <w:t xml:space="preserve">[128] "    mapgl::maplibre_proxy(\"map\") |&gt;"                                                           </w:t>
+      </w:r>
+      <w:r>
+        <w:br/>
+      </w:r>
+      <w:r>
+        <w:rPr>
+          <w:rStyle w:val="VerbatimChar"/>
+        </w:rPr>
+        <w:t xml:space="preserve">[129] "      mapgl::fly_to(center = c(87.99921328178023, 26.633744364809765),"                          </w:t>
+      </w:r>
+      <w:r>
+        <w:br/>
+      </w:r>
+      <w:r>
+        <w:rPr>
+          <w:rStyle w:val="VerbatimChar"/>
+        </w:rPr>
+        <w:t xml:space="preserve">[130] "                    zoom = 16,"                                                                  </w:t>
+      </w:r>
+      <w:r>
+        <w:br/>
+      </w:r>
+      <w:r>
+        <w:rPr>
+          <w:rStyle w:val="VerbatimChar"/>
+        </w:rPr>
+        <w:t xml:space="preserve">[131] "                    pitch = 49,"                                                                 </w:t>
+      </w:r>
+      <w:r>
+        <w:br/>
+      </w:r>
+      <w:r>
+        <w:rPr>
+          <w:rStyle w:val="VerbatimChar"/>
+        </w:rPr>
+        <w:t xml:space="preserve">[132] "                    bearing = 12.8)"                                                             </w:t>
+      </w:r>
+      <w:r>
+        <w:br/>
+      </w:r>
+      <w:r>
+        <w:rPr>
+          <w:rStyle w:val="VerbatimChar"/>
+        </w:rPr>
+        <w:t xml:space="preserve">[133] "  })"                                                                                            </w:t>
+      </w:r>
+      <w:r>
+        <w:br/>
+      </w:r>
+      <w:r>
+        <w:rPr>
+          <w:rStyle w:val="VerbatimChar"/>
+        </w:rPr>
+        <w:t xml:space="preserve">[134] ""                                                                                                </w:t>
+      </w:r>
+      <w:r>
+        <w:br/>
+      </w:r>
+      <w:r>
+        <w:rPr>
+          <w:rStyle w:val="VerbatimChar"/>
+        </w:rPr>
+        <w:t xml:space="preserve">[135] "  mapgl::on_section(\"map\", \"bachelors\", {"                                                   </w:t>
+      </w:r>
+      <w:r>
+        <w:br/>
+      </w:r>
+      <w:r>
+        <w:rPr>
+          <w:rStyle w:val="VerbatimChar"/>
+        </w:rPr>
+        <w:t xml:space="preserve">[136] "    mapgl::maplibre_proxy(\"map\") |&gt;"                                                           </w:t>
+      </w:r>
+      <w:r>
+        <w:br/>
+      </w:r>
+      <w:r>
+        <w:rPr>
+          <w:rStyle w:val="VerbatimChar"/>
+        </w:rPr>
+        <w:t xml:space="preserve">[137] "      mapgl::fly_to(center = c(85.31840215760691, 27.681136558618093),"                          </w:t>
+      </w:r>
+      <w:r>
+        <w:br/>
+      </w:r>
+      <w:r>
+        <w:rPr>
+          <w:rStyle w:val="VerbatimChar"/>
+        </w:rPr>
+        <w:t xml:space="preserve">[138] "                    zoom = 16,"                                                                  </w:t>
+      </w:r>
+      <w:r>
+        <w:br/>
+      </w:r>
+      <w:r>
+        <w:rPr>
+          <w:rStyle w:val="VerbatimChar"/>
+        </w:rPr>
+        <w:t xml:space="preserve">[139] "                    pitch = 49,"                                                                 </w:t>
+      </w:r>
+      <w:r>
+        <w:br/>
+      </w:r>
+      <w:r>
+        <w:rPr>
+          <w:rStyle w:val="VerbatimChar"/>
+        </w:rPr>
+        <w:t xml:space="preserve">[140] "                    bearing = 12.8)"                                                             </w:t>
+      </w:r>
+      <w:r>
+        <w:br/>
+      </w:r>
+      <w:r>
+        <w:rPr>
+          <w:rStyle w:val="VerbatimChar"/>
+        </w:rPr>
+        <w:t xml:space="preserve">[141] "  })"                                                                                            </w:t>
+      </w:r>
+      <w:r>
+        <w:br/>
+      </w:r>
+      <w:r>
+        <w:rPr>
+          <w:rStyle w:val="VerbatimChar"/>
+        </w:rPr>
+        <w:t xml:space="preserve">[142] ""                                                                                                </w:t>
+      </w:r>
+      <w:r>
+        <w:br/>
+      </w:r>
+      <w:r>
+        <w:rPr>
+          <w:rStyle w:val="VerbatimChar"/>
+        </w:rPr>
+        <w:t xml:space="preserve">[143] "  mapgl::on_section(\"map\", \"masters\", {"                                                     </w:t>
+      </w:r>
+      <w:r>
+        <w:br/>
+      </w:r>
+      <w:r>
+        <w:rPr>
+          <w:rStyle w:val="VerbatimChar"/>
+        </w:rPr>
+        <w:t xml:space="preserve">[144] "    mapgl::maplibre_proxy(\"map\") |&gt;"                                                           </w:t>
+      </w:r>
+      <w:r>
+        <w:br/>
+      </w:r>
+      <w:r>
+        <w:rPr>
+          <w:rStyle w:val="VerbatimChar"/>
+        </w:rPr>
+        <w:t xml:space="preserve">[145] "      mapgl::fly_to(center = c(-111.84448004883544, 40.76106105996334),"                         </w:t>
+      </w:r>
+      <w:r>
+        <w:br/>
+      </w:r>
+      <w:r>
+        <w:rPr>
+          <w:rStyle w:val="VerbatimChar"/>
+        </w:rPr>
+        <w:t xml:space="preserve">[146] "                    zoom = 16,"                                                                  </w:t>
+      </w:r>
+      <w:r>
+        <w:br/>
+      </w:r>
+      <w:r>
+        <w:rPr>
+          <w:rStyle w:val="VerbatimChar"/>
+        </w:rPr>
+        <w:t xml:space="preserve">[147] "                    pitch = 49,"                                                                 </w:t>
+      </w:r>
+      <w:r>
+        <w:br/>
+      </w:r>
+      <w:r>
+        <w:rPr>
+          <w:rStyle w:val="VerbatimChar"/>
+        </w:rPr>
+        <w:t xml:space="preserve">[148] "                    bearing = 12.8)"                                                             </w:t>
+      </w:r>
+      <w:r>
+        <w:br/>
+      </w:r>
+      <w:r>
+        <w:rPr>
+          <w:rStyle w:val="VerbatimChar"/>
+        </w:rPr>
+        <w:t xml:space="preserve">[149] "  })"                                                                                            </w:t>
+      </w:r>
+      <w:r>
+        <w:br/>
+      </w:r>
+      <w:r>
+        <w:rPr>
+          <w:rStyle w:val="VerbatimChar"/>
+        </w:rPr>
+        <w:t xml:space="preserve">[150] ""                                                                                                </w:t>
+      </w:r>
+      <w:r>
+        <w:br/>
+      </w:r>
+      <w:r>
+        <w:rPr>
+          <w:rStyle w:val="VerbatimChar"/>
+        </w:rPr>
+        <w:t xml:space="preserve">[151] "  mapgl::on_section(\"map\", \"work_1\", {"                                                      </w:t>
+      </w:r>
+      <w:r>
+        <w:br/>
+      </w:r>
+      <w:r>
+        <w:rPr>
+          <w:rStyle w:val="VerbatimChar"/>
+        </w:rPr>
+        <w:t xml:space="preserve">[152] "    mapgl::maplibre_proxy(\"map\") |&gt;"                                                           </w:t>
+      </w:r>
+      <w:r>
+        <w:br/>
+      </w:r>
+      <w:r>
+        <w:rPr>
+          <w:rStyle w:val="VerbatimChar"/>
+        </w:rPr>
+        <w:t xml:space="preserve">[153] "      mapgl::fly_to(center = c(-84.3938999520061, 33.76728402587881),"                           </w:t>
+      </w:r>
+      <w:r>
+        <w:br/>
+      </w:r>
+      <w:r>
+        <w:rPr>
+          <w:rStyle w:val="VerbatimChar"/>
+        </w:rPr>
+        <w:t xml:space="preserve">[154] "                    zoom = 16,"                                                                  </w:t>
+      </w:r>
+      <w:r>
+        <w:br/>
+      </w:r>
+      <w:r>
+        <w:rPr>
+          <w:rStyle w:val="VerbatimChar"/>
+        </w:rPr>
+        <w:t xml:space="preserve">[155] "                    pitch = 49,"                                                                 </w:t>
+      </w:r>
+      <w:r>
+        <w:br/>
+      </w:r>
+      <w:r>
+        <w:rPr>
+          <w:rStyle w:val="VerbatimChar"/>
+        </w:rPr>
+        <w:t xml:space="preserve">[156] "                    bearing = 12.8)"                                                             </w:t>
+      </w:r>
+      <w:r>
+        <w:br/>
+      </w:r>
+      <w:r>
+        <w:rPr>
+          <w:rStyle w:val="VerbatimChar"/>
+        </w:rPr>
+        <w:t xml:space="preserve">[157] "  })"                                                                                            </w:t>
+      </w:r>
+      <w:r>
+        <w:br/>
+      </w:r>
+      <w:r>
+        <w:rPr>
+          <w:rStyle w:val="VerbatimChar"/>
+        </w:rPr>
+        <w:t xml:space="preserve">[158] ""                                                                                                </w:t>
+      </w:r>
+      <w:r>
+        <w:br/>
+      </w:r>
+      <w:r>
+        <w:rPr>
+          <w:rStyle w:val="VerbatimChar"/>
+        </w:rPr>
+        <w:t xml:space="preserve">[159] "  mapgl::on_section(\"map\", \"work_2\", {"                                                      </w:t>
+      </w:r>
+      <w:r>
+        <w:br/>
+      </w:r>
+      <w:r>
+        <w:rPr>
+          <w:rStyle w:val="VerbatimChar"/>
+        </w:rPr>
+        <w:t xml:space="preserve">[160] "    mapgl::maplibre_proxy(\"map\") |&gt;"                                                           </w:t>
+      </w:r>
+      <w:r>
+        <w:br/>
+      </w:r>
+      <w:r>
+        <w:rPr>
+          <w:rStyle w:val="VerbatimChar"/>
+        </w:rPr>
+        <w:t xml:space="preserve">[161] "      mapgl::fly_to(center = c(-111.90422445885304, 40.76973849954712),"                         </w:t>
+      </w:r>
+      <w:r>
+        <w:br/>
+      </w:r>
+      <w:r>
+        <w:rPr>
+          <w:rStyle w:val="VerbatimChar"/>
+        </w:rPr>
+        <w:t xml:space="preserve">[162] "                    zoom = 16,"                                                                  </w:t>
+      </w:r>
+      <w:r>
+        <w:br/>
+      </w:r>
+      <w:r>
+        <w:rPr>
+          <w:rStyle w:val="VerbatimChar"/>
+        </w:rPr>
+        <w:t xml:space="preserve">[163] "                    pitch = 49,"                                                                 </w:t>
+      </w:r>
+      <w:r>
+        <w:br/>
+      </w:r>
+      <w:r>
+        <w:rPr>
+          <w:rStyle w:val="VerbatimChar"/>
+        </w:rPr>
+        <w:t xml:space="preserve">[164] "                    bearing = 12.8)"                                                             </w:t>
+      </w:r>
+      <w:r>
+        <w:br/>
+      </w:r>
+      <w:r>
+        <w:rPr>
+          <w:rStyle w:val="VerbatimChar"/>
+        </w:rPr>
+        <w:t xml:space="preserve">[165] "  })"                                                                                            </w:t>
+      </w:r>
+      <w:r>
+        <w:br/>
+      </w:r>
+      <w:r>
+        <w:rPr>
+          <w:rStyle w:val="VerbatimChar"/>
+        </w:rPr>
+        <w:t xml:space="preserve">[166] "}"                                                                                               </w:t>
+      </w:r>
+      <w:r>
+        <w:br/>
+      </w:r>
+      <w:r>
+        <w:rPr>
+          <w:rStyle w:val="VerbatimChar"/>
+        </w:rPr>
+        <w:t xml:space="preserve">[167] ""                                                                                                </w:t>
+      </w:r>
+      <w:r>
+        <w:br/>
+      </w:r>
+      <w:r>
+        <w:rPr>
+          <w:rStyle w:val="VerbatimChar"/>
+        </w:rPr>
+        <w:t xml:space="preserve">[168] "shiny::shinyApp(ui, server) # &lt;11&gt;"                                                              </w:t>
       </w:r>
     </w:p>
     <w:bookmarkStart w:id="23" w:name="annotated-cell-2"/>

</xml_diff>

<commit_message>
remove unnecessary sections from storymap post
</commit_message>
<xml_diff>
--- a/docs/posts/storymap_my_journey/index.docx
+++ b/docs/posts/storymap_my_journey/index.docx
@@ -5534,13 +5534,13 @@
     </w:p>
     <w:bookmarkEnd w:id="30"/>
     <w:bookmarkEnd w:id="31"/>
-    <w:bookmarkStart w:id="35" w:name="X7530377c9e00a42c78c192e663d1d6350b97fff"/>
+    <w:bookmarkStart w:id="32" w:name="conclusion"/>
     <w:p>
       <w:pPr>
         <w:pStyle w:val="Heading2"/>
       </w:pPr>
       <w:r>
-        <w:t xml:space="preserve">6 Best Practices for Transportation Data Storymaps</w:t>
+        <w:t xml:space="preserve">6 Conclusion</w:t>
       </w:r>
     </w:p>
     <w:p>
@@ -5548,16 +5548,25 @@
         <w:pStyle w:val="FirstParagraph"/>
       </w:pPr>
       <w:r>
-        <w:t xml:space="preserve">Based on my experience as a transportation planner, here are key considerations when creating storymaps for professional use:</w:t>
-      </w:r>
-    </w:p>
-    <w:bookmarkStart w:id="32" w:name="data-preparation"/>
-    <w:p>
-      <w:pPr>
-        <w:pStyle w:val="Heading3"/>
-      </w:pPr>
-      <w:r>
-        <w:t xml:space="preserve">Data Preparation</w:t>
+        <w:t xml:space="preserve">The {mapgl} package provides a powerful platform for creating engaging, interactive storymaps that can effectively communicate spatial narratives. Whether you’re documenting personal journeys, presenting planning scenarios, or analyzing transportation patterns, this approach offers the flexibility and performance needed for professional applications.</w:t>
+      </w:r>
+    </w:p>
+    <w:p>
+      <w:pPr>
+        <w:pStyle w:val="BodyText"/>
+      </w:pPr>
+      <w:r>
+        <w:t xml:space="preserve">The combination of R’s data processing capabilities with modern web mapping technology creates opportunities for innovative visualization approaches that can enhance public engagement and decision-making processes in transportation planning and urban analytics.</w:t>
+      </w:r>
+    </w:p>
+    <w:bookmarkEnd w:id="32"/>
+    <w:bookmarkStart w:id="37" w:name="additional-resources"/>
+    <w:p>
+      <w:pPr>
+        <w:pStyle w:val="Heading2"/>
+      </w:pPr>
+      <w:r>
+        <w:t xml:space="preserve">7 Additional Resources</w:t>
       </w:r>
     </w:p>
     <w:p>
@@ -5568,424 +5577,7 @@
           <w:numId w:val="1002"/>
         </w:numPr>
       </w:pPr>
-      <w:r>
-        <w:rPr>
-          <w:b/>
-          <w:bCs/>
-        </w:rPr>
-        <w:t xml:space="preserve">Coordinate Accuracy</w:t>
-      </w:r>
-      <w:r>
-        <w:t xml:space="preserve">: Verify coordinates using reliable sources (Google Maps, OpenStreetMap)</w:t>
-      </w:r>
-    </w:p>
-    <w:p>
-      <w:pPr>
-        <w:pStyle w:val="Compact"/>
-        <w:numPr>
-          <w:ilvl w:val="0"/>
-          <w:numId w:val="1002"/>
-        </w:numPr>
-      </w:pPr>
-      <w:r>
-        <w:rPr>
-          <w:b/>
-          <w:bCs/>
-        </w:rPr>
-        <w:t xml:space="preserve">Projection Considerations</w:t>
-      </w:r>
-      <w:r>
-        <w:t xml:space="preserve">: Understand how different projections affect your data representation</w:t>
-      </w:r>
-    </w:p>
-    <w:p>
-      <w:pPr>
-        <w:pStyle w:val="Compact"/>
-        <w:numPr>
-          <w:ilvl w:val="0"/>
-          <w:numId w:val="1002"/>
-        </w:numPr>
-      </w:pPr>
-      <w:r>
-        <w:rPr>
-          <w:b/>
-          <w:bCs/>
-        </w:rPr>
-        <w:t xml:space="preserve">Performance Optimization</w:t>
-      </w:r>
-      <w:r>
-        <w:t xml:space="preserve">: For large datasets, consider data aggregation and level-of-detail strategies</w:t>
-      </w:r>
-    </w:p>
-    <w:bookmarkEnd w:id="32"/>
-    <w:bookmarkStart w:id="33" w:name="visual-design"/>
-    <w:p>
-      <w:pPr>
-        <w:pStyle w:val="Heading3"/>
-      </w:pPr>
-      <w:r>
-        <w:t xml:space="preserve">Visual Design</w:t>
-      </w:r>
-    </w:p>
-    <w:p>
-      <w:pPr>
-        <w:pStyle w:val="Compact"/>
-        <w:numPr>
-          <w:ilvl w:val="0"/>
-          <w:numId w:val="1003"/>
-        </w:numPr>
-      </w:pPr>
-      <w:r>
-        <w:rPr>
-          <w:b/>
-          <w:bCs/>
-        </w:rPr>
-        <w:t xml:space="preserve">Consistent Styling</w:t>
-      </w:r>
-      <w:r>
-        <w:t xml:space="preserve">: Maintain uniform zoom levels, pitch, and bearing for similar content types</w:t>
-      </w:r>
-    </w:p>
-    <w:p>
-      <w:pPr>
-        <w:pStyle w:val="Compact"/>
-        <w:numPr>
-          <w:ilvl w:val="0"/>
-          <w:numId w:val="1003"/>
-        </w:numPr>
-      </w:pPr>
-      <w:r>
-        <w:rPr>
-          <w:b/>
-          <w:bCs/>
-        </w:rPr>
-        <w:t xml:space="preserve">Smooth Transitions</w:t>
-      </w:r>
-      <w:r>
-        <w:t xml:space="preserve">: Use appropriate transition speeds (typically 1-3 seconds)</w:t>
-      </w:r>
-    </w:p>
-    <w:p>
-      <w:pPr>
-        <w:pStyle w:val="Compact"/>
-        <w:numPr>
-          <w:ilvl w:val="0"/>
-          <w:numId w:val="1003"/>
-        </w:numPr>
-      </w:pPr>
-      <w:r>
-        <w:rPr>
-          <w:b/>
-          <w:bCs/>
-        </w:rPr>
-        <w:t xml:space="preserve">Color Schemes</w:t>
-      </w:r>
-      <w:r>
-        <w:t xml:space="preserve">: Choose colors that work well with your base map style</w:t>
-      </w:r>
-    </w:p>
-    <w:p>
-      <w:pPr>
-        <w:pStyle w:val="Compact"/>
-        <w:numPr>
-          <w:ilvl w:val="0"/>
-          <w:numId w:val="1003"/>
-        </w:numPr>
-      </w:pPr>
-      <w:r>
-        <w:rPr>
-          <w:b/>
-          <w:bCs/>
-        </w:rPr>
-        <w:t xml:space="preserve">Typography</w:t>
-      </w:r>
-      <w:r>
-        <w:t xml:space="preserve">: Select readable fonts that complement your organization’s branding</w:t>
-      </w:r>
-    </w:p>
-    <w:bookmarkEnd w:id="33"/>
-    <w:bookmarkStart w:id="34" w:name="user-experience"/>
-    <w:p>
-      <w:pPr>
-        <w:pStyle w:val="Heading3"/>
-      </w:pPr>
-      <w:r>
-        <w:t xml:space="preserve">User Experience</w:t>
-      </w:r>
-    </w:p>
-    <w:p>
-      <w:pPr>
-        <w:pStyle w:val="Compact"/>
-        <w:numPr>
-          <w:ilvl w:val="0"/>
-          <w:numId w:val="1004"/>
-        </w:numPr>
-      </w:pPr>
-      <w:r>
-        <w:rPr>
-          <w:b/>
-          <w:bCs/>
-        </w:rPr>
-        <w:t xml:space="preserve">Logical Flow</w:t>
-      </w:r>
-      <w:r>
-        <w:t xml:space="preserve">: Organize sections in a meaningful sequence (chronological, thematic, etc.)</w:t>
-      </w:r>
-    </w:p>
-    <w:p>
-      <w:pPr>
-        <w:pStyle w:val="Compact"/>
-        <w:numPr>
-          <w:ilvl w:val="0"/>
-          <w:numId w:val="1004"/>
-        </w:numPr>
-      </w:pPr>
-      <w:r>
-        <w:rPr>
-          <w:b/>
-          <w:bCs/>
-        </w:rPr>
-        <w:t xml:space="preserve">Clear Navigation</w:t>
-      </w:r>
-      <w:r>
-        <w:t xml:space="preserve">: Provide obvious cues for how users should interact with the storymap</w:t>
-      </w:r>
-    </w:p>
-    <w:p>
-      <w:pPr>
-        <w:pStyle w:val="Compact"/>
-        <w:numPr>
-          <w:ilvl w:val="0"/>
-          <w:numId w:val="1004"/>
-        </w:numPr>
-      </w:pPr>
-      <w:r>
-        <w:rPr>
-          <w:b/>
-          <w:bCs/>
-        </w:rPr>
-        <w:t xml:space="preserve">Performance</w:t>
-      </w:r>
-      <w:r>
-        <w:t xml:space="preserve">: Test on different devices and internet speeds</w:t>
-      </w:r>
-    </w:p>
-    <w:p>
-      <w:pPr>
-        <w:pStyle w:val="Compact"/>
-        <w:numPr>
-          <w:ilvl w:val="0"/>
-          <w:numId w:val="1004"/>
-        </w:numPr>
-      </w:pPr>
-      <w:r>
-        <w:rPr>
-          <w:b/>
-          <w:bCs/>
-        </w:rPr>
-        <w:t xml:space="preserve">Accessibility</w:t>
-      </w:r>
-      <w:r>
-        <w:t xml:space="preserve">: Ensure content is accessible to users with disabilities</w:t>
-      </w:r>
-    </w:p>
-    <w:bookmarkEnd w:id="34"/>
-    <w:bookmarkEnd w:id="35"/>
-    <w:bookmarkStart w:id="36" w:name="loading-external-app-files"/>
-    <w:p>
-      <w:pPr>
-        <w:pStyle w:val="Heading2"/>
-      </w:pPr>
-      <w:r>
-        <w:t xml:space="preserve">7 Loading External App Files</w:t>
-      </w:r>
-    </w:p>
-    <w:p>
-      <w:pPr>
-        <w:pStyle w:val="FirstParagraph"/>
-      </w:pPr>
-      <w:r>
-        <w:t xml:space="preserve">To load the complete application from an external</w:t>
-      </w:r>
-      <w:r>
-        <w:t xml:space="preserve"> </w:t>
-      </w:r>
-      <w:r>
-        <w:rPr>
-          <w:rStyle w:val="VerbatimChar"/>
-        </w:rPr>
-        <w:t xml:space="preserve">app.R</w:t>
-      </w:r>
-      <w:r>
-        <w:t xml:space="preserve"> </w:t>
-      </w:r>
-      <w:r>
-        <w:t xml:space="preserve">file (which is cleaner for larger applications), you can modify the {shinylive} block:</w:t>
-      </w:r>
-    </w:p>
-    <w:p>
-      <w:pPr>
-        <w:pStyle w:val="SourceCode"/>
-      </w:pPr>
-      <w:r>
-        <w:rPr>
-          <w:rStyle w:val="InformationTok"/>
-        </w:rPr>
-        <w:t xml:space="preserve">```{shinylive-r}</w:t>
-      </w:r>
-      <w:r>
-        <w:br/>
-      </w:r>
-      <w:r>
-        <w:rPr>
-          <w:rStyle w:val="CommentTok"/>
-        </w:rPr>
-        <w:t xml:space="preserve">#| standalone: true</w:t>
-      </w:r>
-      <w:r>
-        <w:br/>
-      </w:r>
-      <w:r>
-        <w:rPr>
-          <w:rStyle w:val="CommentTok"/>
-        </w:rPr>
-        <w:t xml:space="preserve">#| viewerHeight: 600</w:t>
-      </w:r>
-      <w:r>
-        <w:br/>
-      </w:r>
-      <w:r>
-        <w:rPr>
-          <w:rStyle w:val="CommentTok"/>
-        </w:rPr>
-        <w:t xml:space="preserve">#| components: [editor, viewer]</w:t>
-      </w:r>
-      <w:r>
-        <w:br/>
-      </w:r>
-      <w:r>
-        <w:br/>
-      </w:r>
-      <w:r>
-        <w:rPr>
-          <w:rStyle w:val="CommentTok"/>
-        </w:rPr>
-        <w:t xml:space="preserve"># Load the complete application</w:t>
-      </w:r>
-      <w:r>
-        <w:br/>
-      </w:r>
-      <w:r>
-        <w:rPr>
-          <w:rStyle w:val="BuiltInTok"/>
-        </w:rPr>
-        <w:t xml:space="preserve">source</w:t>
-      </w:r>
-      <w:r>
-        <w:rPr>
-          <w:rStyle w:val="ErrorTok"/>
-        </w:rPr>
-        <w:t xml:space="preserve">(</w:t>
-      </w:r>
-      <w:r>
-        <w:rPr>
-          <w:rStyle w:val="StringTok"/>
-        </w:rPr>
-        <w:t xml:space="preserve">"app.R"</w:t>
-      </w:r>
-      <w:r>
-        <w:rPr>
-          <w:rStyle w:val="KeywordTok"/>
-        </w:rPr>
-        <w:t xml:space="preserve">)</w:t>
-      </w:r>
-      <w:r>
-        <w:br/>
-      </w:r>
-      <w:r>
-        <w:rPr>
-          <w:rStyle w:val="InformationTok"/>
-        </w:rPr>
-        <w:t xml:space="preserve">```</w:t>
-      </w:r>
-    </w:p>
-    <w:p>
-      <w:pPr>
-        <w:pStyle w:val="FirstParagraph"/>
-      </w:pPr>
-      <w:r>
-        <w:t xml:space="preserve">This approach allows you to:</w:t>
-      </w:r>
-      <w:r>
-        <w:t xml:space="preserve"> </w:t>
-      </w:r>
-      <w:r>
-        <w:t xml:space="preserve">- Maintain cleaner separation between documentation and code</w:t>
-      </w:r>
-      <w:r>
-        <w:t xml:space="preserve"> </w:t>
-      </w:r>
-      <w:r>
-        <w:t xml:space="preserve">- Enable collaborative development on the application</w:t>
-      </w:r>
-      <w:r>
-        <w:t xml:space="preserve"> </w:t>
-      </w:r>
-      <w:r>
-        <w:t xml:space="preserve">- Version control your application code separately</w:t>
-      </w:r>
-      <w:r>
-        <w:t xml:space="preserve"> </w:t>
-      </w:r>
-      <w:r>
-        <w:t xml:space="preserve">- Reuse the application in different contexts</w:t>
-      </w:r>
-    </w:p>
-    <w:bookmarkEnd w:id="36"/>
-    <w:bookmarkStart w:id="37" w:name="conclusion"/>
-    <w:p>
-      <w:pPr>
-        <w:pStyle w:val="Heading2"/>
-      </w:pPr>
-      <w:r>
-        <w:t xml:space="preserve">8 Conclusion</w:t>
-      </w:r>
-    </w:p>
-    <w:p>
-      <w:pPr>
-        <w:pStyle w:val="FirstParagraph"/>
-      </w:pPr>
-      <w:r>
-        <w:t xml:space="preserve">The {mapgl} package provides a powerful platform for creating engaging, interactive storymaps that can effectively communicate spatial narratives. Whether you’re documenting personal journeys, presenting planning scenarios, or analyzing transportation patterns, this approach offers the flexibility and performance needed for professional applications.</w:t>
-      </w:r>
-    </w:p>
-    <w:p>
-      <w:pPr>
-        <w:pStyle w:val="BodyText"/>
-      </w:pPr>
-      <w:r>
-        <w:t xml:space="preserve">The combination of R’s data processing capabilities with modern web mapping technology creates opportunities for innovative visualization approaches that can enhance public engagement and decision-making processes in transportation planning and urban analytics.</w:t>
-      </w:r>
-    </w:p>
-    <w:bookmarkEnd w:id="37"/>
-    <w:bookmarkStart w:id="42" w:name="additional-resources"/>
-    <w:p>
-      <w:pPr>
-        <w:pStyle w:val="Heading2"/>
-      </w:pPr>
-      <w:r>
-        <w:t xml:space="preserve">9 Additional Resources</w:t>
-      </w:r>
-    </w:p>
-    <w:p>
-      <w:pPr>
-        <w:pStyle w:val="Compact"/>
-        <w:numPr>
-          <w:ilvl w:val="0"/>
-          <w:numId w:val="1005"/>
-        </w:numPr>
-      </w:pPr>
-      <w:hyperlink r:id="rId38">
+      <w:hyperlink r:id="rId33">
         <w:r>
           <w:rPr>
             <w:rStyle w:val="Hyperlink"/>
@@ -5999,10 +5591,10 @@
         <w:pStyle w:val="Compact"/>
         <w:numPr>
           <w:ilvl w:val="0"/>
-          <w:numId w:val="1005"/>
+          <w:numId w:val="1002"/>
         </w:numPr>
       </w:pPr>
-      <w:hyperlink r:id="rId39">
+      <w:hyperlink r:id="rId34">
         <w:r>
           <w:rPr>
             <w:rStyle w:val="Hyperlink"/>
@@ -6016,10 +5608,10 @@
         <w:pStyle w:val="Compact"/>
         <w:numPr>
           <w:ilvl w:val="0"/>
-          <w:numId w:val="1005"/>
+          <w:numId w:val="1002"/>
         </w:numPr>
       </w:pPr>
-      <w:hyperlink r:id="rId40">
+      <w:hyperlink r:id="rId35">
         <w:r>
           <w:rPr>
             <w:rStyle w:val="Hyperlink"/>
@@ -6033,10 +5625,10 @@
         <w:pStyle w:val="Compact"/>
         <w:numPr>
           <w:ilvl w:val="0"/>
-          <w:numId w:val="1005"/>
+          <w:numId w:val="1002"/>
         </w:numPr>
       </w:pPr>
-      <w:hyperlink r:id="rId41">
+      <w:hyperlink r:id="rId36">
         <w:r>
           <w:rPr>
             <w:rStyle w:val="Hyperlink"/>
@@ -6064,7 +5656,7 @@
         <w:t xml:space="preserve">This post demonstrates practical applications of open-source geospatial tools for transportation planning and data visualization. All code is available for adaptation to your own projects and use cases.</w:t>
       </w:r>
     </w:p>
-    <w:bookmarkEnd w:id="42"/>
+    <w:bookmarkEnd w:id="37"/>
     <w:sectPr>
       <w:footnotePr>
         <w:numRestart w:val="eachSect"/>
@@ -6285,15 +5877,6 @@
     <w:abstractNumId w:val="991"/>
   </w:num>
   <w:num w:numId="1002">
-    <w:abstractNumId w:val="991"/>
-  </w:num>
-  <w:num w:numId="1003">
-    <w:abstractNumId w:val="991"/>
-  </w:num>
-  <w:num w:numId="1004">
-    <w:abstractNumId w:val="991"/>
-  </w:num>
-  <w:num w:numId="1005">
     <w:abstractNumId w:val="991"/>
   </w:num>
 </w:numbering>

</xml_diff>

<commit_message>
add direct add instead of source
</commit_message>
<xml_diff>
--- a/docs/posts/storymap_my_journey/index.docx
+++ b/docs/posts/storymap_my_journey/index.docx
@@ -199,7 +199,7 @@
       </w:r>
     </w:p>
     <w:bookmarkEnd w:id="21"/>
-    <w:bookmarkStart w:id="22" w:name="interactive-storymap-demo"/>
+    <w:bookmarkStart w:id="23" w:name="interactive-storymap-demo"/>
     <w:p>
       <w:pPr>
         <w:pStyle w:val="Heading2"/>
@@ -216,6 +216,7 @@
         <w:t xml:space="preserve">Below is the complete interactive storymap. You can scroll through the different sections to see how the map smoothly transitions between locations, each representing a significant milestone in my journey.</w:t>
       </w:r>
     </w:p>
+    <w:bookmarkStart w:id="22" w:name="annotated-cell-1"/>
     <w:p>
       <w:pPr>
         <w:pStyle w:val="SourceCode"/>
@@ -272,11 +273,933 @@
         <w:rPr>
           <w:rStyle w:val="VerbatimChar"/>
         </w:rPr>
-        <w:t xml:space="preserve">source("app.R")</w:t>
+        <w:t xml:space="preserve"># source("app.R")</w:t>
+      </w:r>
+      <w:r>
+        <w:br/>
+      </w:r>
+      <w:r>
+        <w:br/>
+      </w:r>
+      <w:r>
+        <w:rPr>
+          <w:rStyle w:val="VerbatimChar"/>
+        </w:rPr>
+        <w:t xml:space="preserve">library(shiny)</w:t>
+      </w:r>
+      <w:r>
+        <w:br/>
+      </w:r>
+      <w:r>
+        <w:rPr>
+          <w:rStyle w:val="VerbatimChar"/>
+        </w:rPr>
+        <w:t xml:space="preserve">library(mapgl)</w:t>
+      </w:r>
+      <w:r>
+        <w:br/>
+      </w:r>
+      <w:r>
+        <w:br/>
+      </w:r>
+      <w:r>
+        <w:rPr>
+          <w:rStyle w:val="VerbatimChar"/>
+        </w:rPr>
+        <w:t xml:space="preserve">ui &lt;- shiny::fluidPage(</w:t>
+      </w:r>
+      <w:r>
+        <w:br/>
+      </w:r>
+      <w:r>
+        <w:rPr>
+          <w:rStyle w:val="VerbatimChar"/>
+        </w:rPr>
+        <w:t xml:space="preserve">  tags$link(</w:t>
+      </w:r>
+      <w:r>
+        <w:br/>
+      </w:r>
+      <w:r>
+        <w:rPr>
+          <w:rStyle w:val="VerbatimChar"/>
+        </w:rPr>
+        <w:t xml:space="preserve">    href = "https://fonts.googleapis.com/css2?family=Poppins:wght@300;400;600&amp;display=swap",</w:t>
+      </w:r>
+      <w:r>
+        <w:br/>
+      </w:r>
+      <w:r>
+        <w:rPr>
+          <w:rStyle w:val="VerbatimChar"/>
+        </w:rPr>
+        <w:t xml:space="preserve">    rel="stylesheet"</w:t>
+      </w:r>
+      <w:r>
+        <w:br/>
+      </w:r>
+      <w:r>
+        <w:rPr>
+          <w:rStyle w:val="VerbatimChar"/>
+        </w:rPr>
+        <w:t xml:space="preserve">  ),</w:t>
+      </w:r>
+      <w:r>
+        <w:br/>
+      </w:r>
+      <w:r>
+        <w:rPr>
+          <w:rStyle w:val="VerbatimChar"/>
+        </w:rPr>
+        <w:t xml:space="preserve">  mapgl::story_map(</w:t>
+      </w:r>
+      <w:r>
+        <w:br/>
+      </w:r>
+      <w:r>
+        <w:rPr>
+          <w:rStyle w:val="VerbatimChar"/>
+        </w:rPr>
+        <w:t xml:space="preserve">    map_id = "map",</w:t>
+      </w:r>
+      <w:r>
+        <w:br/>
+      </w:r>
+      <w:r>
+        <w:rPr>
+          <w:rStyle w:val="VerbatimChar"/>
+        </w:rPr>
+        <w:t xml:space="preserve">    font_family = "Poppins",</w:t>
+      </w:r>
+      <w:r>
+        <w:br/>
+      </w:r>
+      <w:r>
+        <w:rPr>
+          <w:rStyle w:val="VerbatimChar"/>
+        </w:rPr>
+        <w:t xml:space="preserve">    sections = list(</w:t>
+      </w:r>
+      <w:r>
+        <w:br/>
+      </w:r>
+      <w:r>
+        <w:rPr>
+          <w:rStyle w:val="VerbatimChar"/>
+        </w:rPr>
+        <w:t xml:space="preserve">      "intro" = mapgl::story_section(</w:t>
+      </w:r>
+      <w:r>
+        <w:br/>
+      </w:r>
+      <w:r>
+        <w:rPr>
+          <w:rStyle w:val="VerbatimChar"/>
+        </w:rPr>
+        <w:t xml:space="preserve">        title = "Introduction",</w:t>
+      </w:r>
+      <w:r>
+        <w:br/>
+      </w:r>
+      <w:r>
+        <w:rPr>
+          <w:rStyle w:val="VerbatimChar"/>
+        </w:rPr>
+        <w:t xml:space="preserve">        content = "Hello I am Pukar Bhandari; and this is my life journey."</w:t>
+      </w:r>
+      <w:r>
+        <w:br/>
+      </w:r>
+      <w:r>
+        <w:rPr>
+          <w:rStyle w:val="VerbatimChar"/>
+        </w:rPr>
+        <w:t xml:space="preserve">      ),</w:t>
+      </w:r>
+      <w:r>
+        <w:br/>
+      </w:r>
+      <w:r>
+        <w:rPr>
+          <w:rStyle w:val="VerbatimChar"/>
+        </w:rPr>
+        <w:t xml:space="preserve">      "childhood" = mapgl::story_section(</w:t>
+      </w:r>
+      <w:r>
+        <w:br/>
+      </w:r>
+      <w:r>
+        <w:rPr>
+          <w:rStyle w:val="VerbatimChar"/>
+        </w:rPr>
+        <w:t xml:space="preserve">        title = "Birtamode, Jhapa",</w:t>
+      </w:r>
+      <w:r>
+        <w:br/>
+      </w:r>
+      <w:r>
+        <w:rPr>
+          <w:rStyle w:val="VerbatimChar"/>
+        </w:rPr>
+        <w:t xml:space="preserve">        content = "This is where I was born and spent the early part of my life until 2013."</w:t>
+      </w:r>
+      <w:r>
+        <w:br/>
+      </w:r>
+      <w:r>
+        <w:rPr>
+          <w:rStyle w:val="VerbatimChar"/>
+        </w:rPr>
+        <w:t xml:space="preserve">      ),</w:t>
+      </w:r>
+      <w:r>
+        <w:br/>
+      </w:r>
+      <w:r>
+        <w:rPr>
+          <w:rStyle w:val="VerbatimChar"/>
+        </w:rPr>
+        <w:t xml:space="preserve">      "bachelors" = mapgl::story_section(</w:t>
+      </w:r>
+      <w:r>
+        <w:br/>
+      </w:r>
+      <w:r>
+        <w:rPr>
+          <w:rStyle w:val="VerbatimChar"/>
+        </w:rPr>
+        <w:t xml:space="preserve">        title = "Pulchowk, Lalitpur",</w:t>
+      </w:r>
+      <w:r>
+        <w:br/>
+      </w:r>
+      <w:r>
+        <w:rPr>
+          <w:rStyle w:val="VerbatimChar"/>
+        </w:rPr>
+        <w:t xml:space="preserve">        content = "I then moved to Pulchowk in the pursuit of higher education. I obtained my Bachelor's Degree in Architecture from Institute of Engineering Pulchowk Campus in 2018."</w:t>
+      </w:r>
+      <w:r>
+        <w:br/>
+      </w:r>
+      <w:r>
+        <w:rPr>
+          <w:rStyle w:val="VerbatimChar"/>
+        </w:rPr>
+        <w:t xml:space="preserve">      ),</w:t>
+      </w:r>
+      <w:r>
+        <w:br/>
+      </w:r>
+      <w:r>
+        <w:rPr>
+          <w:rStyle w:val="VerbatimChar"/>
+        </w:rPr>
+        <w:t xml:space="preserve">      "masters" = mapgl::story_section(</w:t>
+      </w:r>
+      <w:r>
+        <w:br/>
+      </w:r>
+      <w:r>
+        <w:rPr>
+          <w:rStyle w:val="VerbatimChar"/>
+        </w:rPr>
+        <w:t xml:space="preserve">        title = "Salt Lake City, UT",</w:t>
+      </w:r>
+      <w:r>
+        <w:br/>
+      </w:r>
+      <w:r>
+        <w:rPr>
+          <w:rStyle w:val="VerbatimChar"/>
+        </w:rPr>
+        <w:t xml:space="preserve">        content = "In pursuit of even higher education, I moved to Salt Lake City, UT where I obtained my Master of City &amp; Metropolitan Planning degree from the University of Utah in May 2023."</w:t>
+      </w:r>
+      <w:r>
+        <w:br/>
+      </w:r>
+      <w:r>
+        <w:rPr>
+          <w:rStyle w:val="VerbatimChar"/>
+        </w:rPr>
+        <w:t xml:space="preserve">      ),</w:t>
+      </w:r>
+      <w:r>
+        <w:br/>
+      </w:r>
+      <w:r>
+        <w:rPr>
+          <w:rStyle w:val="VerbatimChar"/>
+        </w:rPr>
+        <w:t xml:space="preserve">      "metro_analytics" = mapgl::story_section(</w:t>
+      </w:r>
+      <w:r>
+        <w:br/>
+      </w:r>
+      <w:r>
+        <w:rPr>
+          <w:rStyle w:val="VerbatimChar"/>
+        </w:rPr>
+        <w:t xml:space="preserve">        title = "Atlanta, GA",</w:t>
+      </w:r>
+      <w:r>
+        <w:br/>
+      </w:r>
+      <w:r>
+        <w:rPr>
+          <w:rStyle w:val="VerbatimChar"/>
+        </w:rPr>
+        <w:t xml:space="preserve">        content = "I then moved to Altanta in June 2023 to work as a transportation planner &amp; analyst at Metro Analytics until September 2025."</w:t>
+      </w:r>
+      <w:r>
+        <w:br/>
+      </w:r>
+      <w:r>
+        <w:rPr>
+          <w:rStyle w:val="VerbatimChar"/>
+        </w:rPr>
+        <w:t xml:space="preserve">      ),</w:t>
+      </w:r>
+      <w:r>
+        <w:br/>
+      </w:r>
+      <w:r>
+        <w:rPr>
+          <w:rStyle w:val="VerbatimChar"/>
+        </w:rPr>
+        <w:t xml:space="preserve">      "wfrc_ut" = mapgl::story_section(</w:t>
+      </w:r>
+      <w:r>
+        <w:br/>
+      </w:r>
+      <w:r>
+        <w:rPr>
+          <w:rStyle w:val="VerbatimChar"/>
+        </w:rPr>
+        <w:t xml:space="preserve">        title = "Back to Salt Lake City, UT",</w:t>
+      </w:r>
+      <w:r>
+        <w:br/>
+      </w:r>
+      <w:r>
+        <w:rPr>
+          <w:rStyle w:val="VerbatimChar"/>
+        </w:rPr>
+        <w:t xml:space="preserve">        content = "After gaining entry-level experience in transportation planning, travel demand modeling, and data analytics, I moved back to Salt Lake City - a place I am personally and professionally attached to - in order to join the awesome analytics team at the Wasatch Front Regional Council."</w:t>
+      </w:r>
+      <w:r>
+        <w:br/>
+      </w:r>
+      <w:r>
+        <w:rPr>
+          <w:rStyle w:val="VerbatimChar"/>
+        </w:rPr>
+        <w:t xml:space="preserve">      )</w:t>
+      </w:r>
+      <w:r>
+        <w:br/>
+      </w:r>
+      <w:r>
+        <w:rPr>
+          <w:rStyle w:val="VerbatimChar"/>
+        </w:rPr>
+        <w:t xml:space="preserve">    ),</w:t>
+      </w:r>
+      <w:r>
+        <w:br/>
+      </w:r>
+      <w:r>
+        <w:rPr>
+          <w:rStyle w:val="VerbatimChar"/>
+        </w:rPr>
+        <w:t xml:space="preserve">    map_type = "maplibre"</w:t>
+      </w:r>
+      <w:r>
+        <w:br/>
+      </w:r>
+      <w:r>
+        <w:rPr>
+          <w:rStyle w:val="VerbatimChar"/>
+        </w:rPr>
+        <w:t xml:space="preserve">  )</w:t>
+      </w:r>
+      <w:r>
+        <w:br/>
+      </w:r>
+      <w:r>
+        <w:rPr>
+          <w:rStyle w:val="VerbatimChar"/>
+        </w:rPr>
+        <w:t xml:space="preserve">)</w:t>
+      </w:r>
+      <w:r>
+        <w:br/>
+      </w:r>
+      <w:r>
+        <w:br/>
+      </w:r>
+      <w:r>
+        <w:rPr>
+          <w:rStyle w:val="VerbatimChar"/>
+        </w:rPr>
+        <w:t xml:space="preserve">server &lt;- function(input, output, session) {</w:t>
+      </w:r>
+      <w:r>
+        <w:br/>
+      </w:r>
+      <w:r>
+        <w:rPr>
+          <w:rStyle w:val="VerbatimChar"/>
+        </w:rPr>
+        <w:t xml:space="preserve">  output$map &lt;- mapgl::renderMaplibre({</w:t>
+      </w:r>
+      <w:r>
+        <w:br/>
+      </w:r>
+      <w:r>
+        <w:rPr>
+          <w:rStyle w:val="VerbatimChar"/>
+        </w:rPr>
+        <w:t xml:space="preserve">    mapgl::maplibre(</w:t>
+      </w:r>
+      <w:r>
+        <w:br/>
+      </w:r>
+      <w:r>
+        <w:rPr>
+          <w:rStyle w:val="VerbatimChar"/>
+        </w:rPr>
+        <w:t xml:space="preserve">      style = "https://tiles.openfreemap.org/styles/liberty",</w:t>
+      </w:r>
+      <w:r>
+        <w:br/>
+      </w:r>
+      <w:r>
+        <w:rPr>
+          <w:rStyle w:val="VerbatimChar"/>
+        </w:rPr>
+        <w:t xml:space="preserve">      center = c(0, 0),</w:t>
+      </w:r>
+      <w:r>
+        <w:br/>
+      </w:r>
+      <w:r>
+        <w:rPr>
+          <w:rStyle w:val="VerbatimChar"/>
+        </w:rPr>
+        <w:t xml:space="preserve">      zoom = 2.75,</w:t>
+      </w:r>
+      <w:r>
+        <w:br/>
+      </w:r>
+      <w:r>
+        <w:rPr>
+          <w:rStyle w:val="VerbatimChar"/>
+        </w:rPr>
+        <w:t xml:space="preserve">      scrollZoom = FALSE</w:t>
+      </w:r>
+      <w:r>
+        <w:br/>
+      </w:r>
+      <w:r>
+        <w:rPr>
+          <w:rStyle w:val="VerbatimChar"/>
+        </w:rPr>
+        <w:t xml:space="preserve">    ) |&gt;</w:t>
+      </w:r>
+      <w:r>
+        <w:br/>
+      </w:r>
+      <w:r>
+        <w:rPr>
+          <w:rStyle w:val="VerbatimChar"/>
+        </w:rPr>
+        <w:t xml:space="preserve">      mapgl::set_projection(projection = "globe") |&gt;</w:t>
+      </w:r>
+      <w:r>
+        <w:br/>
+      </w:r>
+      <w:r>
+        <w:rPr>
+          <w:rStyle w:val="VerbatimChar"/>
+        </w:rPr>
+        <w:t xml:space="preserve">      mapgl::add_globe_control() |&gt;</w:t>
+      </w:r>
+      <w:r>
+        <w:br/>
+      </w:r>
+      <w:r>
+        <w:rPr>
+          <w:rStyle w:val="VerbatimChar"/>
+        </w:rPr>
+        <w:t xml:space="preserve">      mapgl::add_navigation_control(visualize_pitch = TRUE) |&gt;</w:t>
+      </w:r>
+      <w:r>
+        <w:br/>
+      </w:r>
+      <w:r>
+        <w:rPr>
+          <w:rStyle w:val="VerbatimChar"/>
+        </w:rPr>
+        <w:t xml:space="preserve">      mapgl::add_globe_minimap(position = "bottom-left")</w:t>
+      </w:r>
+      <w:r>
+        <w:br/>
+      </w:r>
+      <w:r>
+        <w:rPr>
+          <w:rStyle w:val="VerbatimChar"/>
+        </w:rPr>
+        <w:t xml:space="preserve">  })</w:t>
+      </w:r>
+      <w:r>
+        <w:br/>
+      </w:r>
+      <w:r>
+        <w:br/>
+      </w:r>
+      <w:r>
+        <w:rPr>
+          <w:rStyle w:val="VerbatimChar"/>
+        </w:rPr>
+        <w:t xml:space="preserve">  mapgl::on_section("map", "intro", {</w:t>
+      </w:r>
+      <w:r>
+        <w:br/>
+      </w:r>
+      <w:r>
+        <w:rPr>
+          <w:rStyle w:val="VerbatimChar"/>
+        </w:rPr>
+        <w:t xml:space="preserve">    mapgl::maplibre_proxy("map") |&gt;</w:t>
+      </w:r>
+      <w:r>
+        <w:br/>
+      </w:r>
+      <w:r>
+        <w:rPr>
+          <w:rStyle w:val="VerbatimChar"/>
+        </w:rPr>
+        <w:t xml:space="preserve">      mapgl::clear_markers() |&gt;</w:t>
+      </w:r>
+      <w:r>
+        <w:br/>
+      </w:r>
+      <w:r>
+        <w:rPr>
+          <w:rStyle w:val="VerbatimChar"/>
+        </w:rPr>
+        <w:t xml:space="preserve">      mapgl::fly_to(</w:t>
+      </w:r>
+      <w:r>
+        <w:br/>
+      </w:r>
+      <w:r>
+        <w:rPr>
+          <w:rStyle w:val="VerbatimChar"/>
+        </w:rPr>
+        <w:t xml:space="preserve">        center = c(0, 0),</w:t>
+      </w:r>
+      <w:r>
+        <w:br/>
+      </w:r>
+      <w:r>
+        <w:rPr>
+          <w:rStyle w:val="VerbatimChar"/>
+        </w:rPr>
+        <w:t xml:space="preserve">        zoom = 2.75,</w:t>
+      </w:r>
+      <w:r>
+        <w:br/>
+      </w:r>
+      <w:r>
+        <w:rPr>
+          <w:rStyle w:val="VerbatimChar"/>
+        </w:rPr>
+        <w:t xml:space="preserve">        pitch = 0,</w:t>
+      </w:r>
+      <w:r>
+        <w:br/>
+      </w:r>
+      <w:r>
+        <w:rPr>
+          <w:rStyle w:val="VerbatimChar"/>
+        </w:rPr>
+        <w:t xml:space="preserve">        bearing = 0</w:t>
+      </w:r>
+      <w:r>
+        <w:br/>
+      </w:r>
+      <w:r>
+        <w:rPr>
+          <w:rStyle w:val="VerbatimChar"/>
+        </w:rPr>
+        <w:t xml:space="preserve">      )</w:t>
+      </w:r>
+      <w:r>
+        <w:br/>
+      </w:r>
+      <w:r>
+        <w:rPr>
+          <w:rStyle w:val="VerbatimChar"/>
+        </w:rPr>
+        <w:t xml:space="preserve">  })</w:t>
+      </w:r>
+      <w:r>
+        <w:br/>
+      </w:r>
+      <w:r>
+        <w:br/>
+      </w:r>
+      <w:r>
+        <w:rPr>
+          <w:rStyle w:val="VerbatimChar"/>
+        </w:rPr>
+        <w:t xml:space="preserve">  mapgl::on_section("map", "childhood", {</w:t>
+      </w:r>
+      <w:r>
+        <w:br/>
+      </w:r>
+      <w:r>
+        <w:rPr>
+          <w:rStyle w:val="VerbatimChar"/>
+        </w:rPr>
+        <w:t xml:space="preserve">    mapgl::maplibre_proxy("map") |&gt;</w:t>
+      </w:r>
+      <w:r>
+        <w:br/>
+      </w:r>
+      <w:r>
+        <w:rPr>
+          <w:rStyle w:val="VerbatimChar"/>
+        </w:rPr>
+        <w:t xml:space="preserve">      mapgl::fly_to(center = c(87.99371750247397, 26.646533355308083),</w:t>
+      </w:r>
+      <w:r>
+        <w:br/>
+      </w:r>
+      <w:r>
+        <w:rPr>
+          <w:rStyle w:val="VerbatimChar"/>
+        </w:rPr>
+        <w:t xml:space="preserve">                    zoom = 16,</w:t>
+      </w:r>
+      <w:r>
+        <w:br/>
+      </w:r>
+      <w:r>
+        <w:rPr>
+          <w:rStyle w:val="VerbatimChar"/>
+        </w:rPr>
+        <w:t xml:space="preserve">                    pitch = 49,</w:t>
+      </w:r>
+      <w:r>
+        <w:br/>
+      </w:r>
+      <w:r>
+        <w:rPr>
+          <w:rStyle w:val="VerbatimChar"/>
+        </w:rPr>
+        <w:t xml:space="preserve">                    bearing = 12.8)</w:t>
+      </w:r>
+      <w:r>
+        <w:br/>
+      </w:r>
+      <w:r>
+        <w:rPr>
+          <w:rStyle w:val="VerbatimChar"/>
+        </w:rPr>
+        <w:t xml:space="preserve">  })</w:t>
+      </w:r>
+      <w:r>
+        <w:br/>
+      </w:r>
+      <w:r>
+        <w:br/>
+      </w:r>
+      <w:r>
+        <w:rPr>
+          <w:rStyle w:val="VerbatimChar"/>
+        </w:rPr>
+        <w:t xml:space="preserve">  mapgl::on_section("map", "bachelors", {</w:t>
+      </w:r>
+      <w:r>
+        <w:br/>
+      </w:r>
+      <w:r>
+        <w:rPr>
+          <w:rStyle w:val="VerbatimChar"/>
+        </w:rPr>
+        <w:t xml:space="preserve">    mapgl::maplibre_proxy("map") |&gt;</w:t>
+      </w:r>
+      <w:r>
+        <w:br/>
+      </w:r>
+      <w:r>
+        <w:rPr>
+          <w:rStyle w:val="VerbatimChar"/>
+        </w:rPr>
+        <w:t xml:space="preserve">      mapgl::fly_to(center = c(85.31840215760691, 27.681136558618093),</w:t>
+      </w:r>
+      <w:r>
+        <w:br/>
+      </w:r>
+      <w:r>
+        <w:rPr>
+          <w:rStyle w:val="VerbatimChar"/>
+        </w:rPr>
+        <w:t xml:space="preserve">                    zoom = 16,</w:t>
+      </w:r>
+      <w:r>
+        <w:br/>
+      </w:r>
+      <w:r>
+        <w:rPr>
+          <w:rStyle w:val="VerbatimChar"/>
+        </w:rPr>
+        <w:t xml:space="preserve">                    pitch = 49,</w:t>
+      </w:r>
+      <w:r>
+        <w:br/>
+      </w:r>
+      <w:r>
+        <w:rPr>
+          <w:rStyle w:val="VerbatimChar"/>
+        </w:rPr>
+        <w:t xml:space="preserve">                    bearing = 12.8)</w:t>
+      </w:r>
+      <w:r>
+        <w:br/>
+      </w:r>
+      <w:r>
+        <w:rPr>
+          <w:rStyle w:val="VerbatimChar"/>
+        </w:rPr>
+        <w:t xml:space="preserve">  })</w:t>
+      </w:r>
+      <w:r>
+        <w:br/>
+      </w:r>
+      <w:r>
+        <w:br/>
+      </w:r>
+      <w:r>
+        <w:rPr>
+          <w:rStyle w:val="VerbatimChar"/>
+        </w:rPr>
+        <w:t xml:space="preserve">  mapgl::on_section("map", "masters", {</w:t>
+      </w:r>
+      <w:r>
+        <w:br/>
+      </w:r>
+      <w:r>
+        <w:rPr>
+          <w:rStyle w:val="VerbatimChar"/>
+        </w:rPr>
+        <w:t xml:space="preserve">    mapgl::maplibre_proxy("map") |&gt;</w:t>
+      </w:r>
+      <w:r>
+        <w:br/>
+      </w:r>
+      <w:r>
+        <w:rPr>
+          <w:rStyle w:val="VerbatimChar"/>
+        </w:rPr>
+        <w:t xml:space="preserve">      mapgl::fly_to(center = c(-111.84448004883544, 40.76106105996334),</w:t>
+      </w:r>
+      <w:r>
+        <w:br/>
+      </w:r>
+      <w:r>
+        <w:rPr>
+          <w:rStyle w:val="VerbatimChar"/>
+        </w:rPr>
+        <w:t xml:space="preserve">                    zoom = 16,</w:t>
+      </w:r>
+      <w:r>
+        <w:br/>
+      </w:r>
+      <w:r>
+        <w:rPr>
+          <w:rStyle w:val="VerbatimChar"/>
+        </w:rPr>
+        <w:t xml:space="preserve">                    pitch = 49,</w:t>
+      </w:r>
+      <w:r>
+        <w:br/>
+      </w:r>
+      <w:r>
+        <w:rPr>
+          <w:rStyle w:val="VerbatimChar"/>
+        </w:rPr>
+        <w:t xml:space="preserve">                    bearing = 12.8)</w:t>
+      </w:r>
+      <w:r>
+        <w:br/>
+      </w:r>
+      <w:r>
+        <w:rPr>
+          <w:rStyle w:val="VerbatimChar"/>
+        </w:rPr>
+        <w:t xml:space="preserve">  })</w:t>
+      </w:r>
+      <w:r>
+        <w:br/>
+      </w:r>
+      <w:r>
+        <w:br/>
+      </w:r>
+      <w:r>
+        <w:rPr>
+          <w:rStyle w:val="VerbatimChar"/>
+        </w:rPr>
+        <w:t xml:space="preserve">  mapgl::on_section("map", "metro_analytics", {</w:t>
+      </w:r>
+      <w:r>
+        <w:br/>
+      </w:r>
+      <w:r>
+        <w:rPr>
+          <w:rStyle w:val="VerbatimChar"/>
+        </w:rPr>
+        <w:t xml:space="preserve">    mapgl::maplibre_proxy("map") |&gt;</w:t>
+      </w:r>
+      <w:r>
+        <w:br/>
+      </w:r>
+      <w:r>
+        <w:rPr>
+          <w:rStyle w:val="VerbatimChar"/>
+        </w:rPr>
+        <w:t xml:space="preserve">      mapgl::fly_to(center = c(-84.3938999520061, 33.76728402587881),</w:t>
+      </w:r>
+      <w:r>
+        <w:br/>
+      </w:r>
+      <w:r>
+        <w:rPr>
+          <w:rStyle w:val="VerbatimChar"/>
+        </w:rPr>
+        <w:t xml:space="preserve">                    zoom = 16,</w:t>
+      </w:r>
+      <w:r>
+        <w:br/>
+      </w:r>
+      <w:r>
+        <w:rPr>
+          <w:rStyle w:val="VerbatimChar"/>
+        </w:rPr>
+        <w:t xml:space="preserve">                    pitch = 49,</w:t>
+      </w:r>
+      <w:r>
+        <w:br/>
+      </w:r>
+      <w:r>
+        <w:rPr>
+          <w:rStyle w:val="VerbatimChar"/>
+        </w:rPr>
+        <w:t xml:space="preserve">                    bearing = 12.8)</w:t>
+      </w:r>
+      <w:r>
+        <w:br/>
+      </w:r>
+      <w:r>
+        <w:rPr>
+          <w:rStyle w:val="VerbatimChar"/>
+        </w:rPr>
+        <w:t xml:space="preserve">  })</w:t>
+      </w:r>
+      <w:r>
+        <w:br/>
+      </w:r>
+      <w:r>
+        <w:br/>
+      </w:r>
+      <w:r>
+        <w:rPr>
+          <w:rStyle w:val="VerbatimChar"/>
+        </w:rPr>
+        <w:t xml:space="preserve">  mapgl::on_section("map", "wfrc_ut", {</w:t>
+      </w:r>
+      <w:r>
+        <w:br/>
+      </w:r>
+      <w:r>
+        <w:rPr>
+          <w:rStyle w:val="VerbatimChar"/>
+        </w:rPr>
+        <w:t xml:space="preserve">    mapgl::maplibre_proxy("map") |&gt;</w:t>
+      </w:r>
+      <w:r>
+        <w:br/>
+      </w:r>
+      <w:r>
+        <w:rPr>
+          <w:rStyle w:val="VerbatimChar"/>
+        </w:rPr>
+        <w:t xml:space="preserve">      mapgl::fly_to(center = c(-111.90422445885304, 40.76973849954712),</w:t>
+      </w:r>
+      <w:r>
+        <w:br/>
+      </w:r>
+      <w:r>
+        <w:rPr>
+          <w:rStyle w:val="VerbatimChar"/>
+        </w:rPr>
+        <w:t xml:space="preserve">                    zoom = 16,</w:t>
+      </w:r>
+      <w:r>
+        <w:br/>
+      </w:r>
+      <w:r>
+        <w:rPr>
+          <w:rStyle w:val="VerbatimChar"/>
+        </w:rPr>
+        <w:t xml:space="preserve">                    pitch = 49,</w:t>
+      </w:r>
+      <w:r>
+        <w:br/>
+      </w:r>
+      <w:r>
+        <w:rPr>
+          <w:rStyle w:val="VerbatimChar"/>
+        </w:rPr>
+        <w:t xml:space="preserve">                    bearing = 12.8)</w:t>
+      </w:r>
+      <w:r>
+        <w:br/>
+      </w:r>
+      <w:r>
+        <w:rPr>
+          <w:rStyle w:val="VerbatimChar"/>
+        </w:rPr>
+        <w:t xml:space="preserve">  })</w:t>
+      </w:r>
+      <w:r>
+        <w:br/>
+      </w:r>
+      <w:r>
+        <w:rPr>
+          <w:rStyle w:val="VerbatimChar"/>
+        </w:rPr>
+        <w:t xml:space="preserve">}</w:t>
+      </w:r>
+      <w:r>
+        <w:br/>
+      </w:r>
+      <w:r>
+        <w:br/>
+      </w:r>
+      <w:r>
+        <w:rPr>
+          <w:rStyle w:val="VerbatimChar"/>
+        </w:rPr>
+        <w:t xml:space="preserve">shiny::shinyApp(ui, server)</w:t>
       </w:r>
     </w:p>
     <w:bookmarkEnd w:id="22"/>
-    <w:bookmarkStart w:id="24" w:name="source-code"/>
+    <w:bookmarkEnd w:id="23"/>
+    <w:bookmarkStart w:id="25" w:name="source-code"/>
     <w:p>
       <w:pPr>
         <w:pStyle w:val="Heading2"/>
@@ -293,7 +1216,7 @@
         <w:t xml:space="preserve">The storymap application follows a typical Shiny structure with some specialized {mapgl} components. Following is the source code for this dashboard (Please click on the numbers on the far right for additional explanation of syntax and mechanics):</w:t>
       </w:r>
     </w:p>
-    <w:bookmarkStart w:id="23" w:name="annotated-cell-1"/>
+    <w:bookmarkStart w:id="24" w:name="annotated-cell-2"/>
     <w:p>
       <w:pPr>
         <w:pStyle w:val="SourceCode"/>
@@ -3356,7 +4279,7 @@
         <w:t xml:space="preserve">(ui, server)</w:t>
       </w:r>
     </w:p>
-    <w:bookmarkEnd w:id="23"/>
+    <w:bookmarkEnd w:id="24"/>
     <w:p>
       <w:pPr>
         <w:pStyle w:val="DefinitionTerm"/>
@@ -3536,8 +4459,8 @@
         <w:t xml:space="preserve">Launch the Shiny application combining UI and server components</w:t>
       </w:r>
     </w:p>
-    <w:bookmarkEnd w:id="24"/>
-    <w:bookmarkStart w:id="31" w:name="understanding-the-app-structure"/>
+    <w:bookmarkEnd w:id="25"/>
+    <w:bookmarkStart w:id="32" w:name="understanding-the-app-structure"/>
     <w:p>
       <w:pPr>
         <w:pStyle w:val="Heading2"/>
@@ -3546,7 +4469,7 @@
         <w:t xml:space="preserve">5 Understanding the App Structure</w:t>
       </w:r>
     </w:p>
-    <w:bookmarkStart w:id="26" w:name="setting-up-the-user-interface"/>
+    <w:bookmarkStart w:id="27" w:name="setting-up-the-user-interface"/>
     <w:p>
       <w:pPr>
         <w:pStyle w:val="Heading3"/>
@@ -3555,7 +4478,7 @@
         <w:t xml:space="preserve">Setting Up the User Interface</w:t>
       </w:r>
     </w:p>
-    <w:bookmarkStart w:id="25" w:name="annotated-cell-2"/>
+    <w:bookmarkStart w:id="26" w:name="annotated-cell-3"/>
     <w:p>
       <w:pPr>
         <w:pStyle w:val="SourceCode"/>
@@ -3978,7 +4901,7 @@
         <w:rPr>
           <w:rStyle w:val="StringTok"/>
         </w:rPr>
-        <w:t xml:space="preserve">"birth_place"</w:t>
+        <w:t xml:space="preserve">"childhood"</w:t>
       </w:r>
       <w:r>
         <w:rPr>
@@ -4041,7 +4964,7 @@
         <w:rPr>
           <w:rStyle w:val="StringTok"/>
         </w:rPr>
-        <w:t xml:space="preserve">"Birth Place"</w:t>
+        <w:t xml:space="preserve">"Birtamode, Jhapa"</w:t>
       </w:r>
       <w:r>
         <w:rPr>
@@ -4074,7 +4997,7 @@
         <w:rPr>
           <w:rStyle w:val="StringTok"/>
         </w:rPr>
-        <w:t xml:space="preserve">"This is where I was born."</w:t>
+        <w:t xml:space="preserve">"This is where I was born and spent the early part of my life until 2013."</w:t>
       </w:r>
       <w:r>
         <w:br/>
@@ -4155,7 +5078,7 @@
         <w:t xml:space="preserve">)</w:t>
       </w:r>
     </w:p>
-    <w:bookmarkEnd w:id="25"/>
+    <w:bookmarkEnd w:id="26"/>
     <w:p>
       <w:pPr>
         <w:pStyle w:val="DefinitionTerm"/>
@@ -4317,8 +5240,8 @@
         <w:t xml:space="preserve">: Using MapLibre GL JS for performant vector tile rendering</w:t>
       </w:r>
     </w:p>
-    <w:bookmarkEnd w:id="26"/>
-    <w:bookmarkStart w:id="28" w:name="configuring-the-map"/>
+    <w:bookmarkEnd w:id="27"/>
+    <w:bookmarkStart w:id="29" w:name="configuring-the-map"/>
     <w:p>
       <w:pPr>
         <w:pStyle w:val="Heading3"/>
@@ -4327,7 +5250,7 @@
         <w:t xml:space="preserve">Configuring the Map</w:t>
       </w:r>
     </w:p>
-    <w:bookmarkStart w:id="27" w:name="annotated-cell-3"/>
+    <w:bookmarkStart w:id="28" w:name="annotated-cell-4"/>
     <w:p>
       <w:pPr>
         <w:pStyle w:val="SourceCode"/>
@@ -4822,7 +5745,7 @@
         <w:t xml:space="preserve">}</w:t>
       </w:r>
     </w:p>
-    <w:bookmarkEnd w:id="27"/>
+    <w:bookmarkEnd w:id="28"/>
     <w:p>
       <w:pPr>
         <w:pStyle w:val="DefinitionTerm"/>
@@ -5030,8 +5953,8 @@
         <w:t xml:space="preserve">: Provides geographic context when zoomed in on specific locations</w:t>
       </w:r>
     </w:p>
-    <w:bookmarkEnd w:id="28"/>
-    <w:bookmarkStart w:id="30" w:name="implementing-section-behaviors"/>
+    <w:bookmarkEnd w:id="29"/>
+    <w:bookmarkStart w:id="31" w:name="implementing-section-behaviors"/>
     <w:p>
       <w:pPr>
         <w:pStyle w:val="Heading3"/>
@@ -5040,7 +5963,7 @@
         <w:t xml:space="preserve">Implementing Section Behaviors</w:t>
       </w:r>
     </w:p>
-    <w:bookmarkStart w:id="29" w:name="annotated-cell-4"/>
+    <w:bookmarkStart w:id="30" w:name="annotated-cell-5"/>
     <w:p>
       <w:pPr>
         <w:pStyle w:val="SourceCode"/>
@@ -5094,7 +6017,7 @@
         <w:rPr>
           <w:rStyle w:val="StringTok"/>
         </w:rPr>
-        <w:t xml:space="preserve">"birth_place"</w:t>
+        <w:t xml:space="preserve">"childhood"</w:t>
       </w:r>
       <w:r>
         <w:rPr>
@@ -5343,7 +6266,7 @@
         <w:t xml:space="preserve">})</w:t>
       </w:r>
     </w:p>
-    <w:bookmarkEnd w:id="29"/>
+    <w:bookmarkEnd w:id="30"/>
     <w:p>
       <w:pPr>
         <w:pStyle w:val="DefinitionTerm"/>
@@ -5532,9 +6455,9 @@
         <w:t xml:space="preserve">: Oriented to show the location from the most informative angle</w:t>
       </w:r>
     </w:p>
-    <w:bookmarkEnd w:id="30"/>
     <w:bookmarkEnd w:id="31"/>
-    <w:bookmarkStart w:id="32" w:name="conclusion"/>
+    <w:bookmarkEnd w:id="32"/>
+    <w:bookmarkStart w:id="33" w:name="conclusion"/>
     <w:p>
       <w:pPr>
         <w:pStyle w:val="Heading2"/>
@@ -5559,8 +6482,8 @@
         <w:t xml:space="preserve">The combination of R’s data processing capabilities with modern web mapping technology creates opportunities for innovative visualization approaches that can enhance public engagement and decision-making processes in transportation planning and urban analytics.</w:t>
       </w:r>
     </w:p>
-    <w:bookmarkEnd w:id="32"/>
-    <w:bookmarkStart w:id="37" w:name="additional-resources"/>
+    <w:bookmarkEnd w:id="33"/>
+    <w:bookmarkStart w:id="38" w:name="additional-resources"/>
     <w:p>
       <w:pPr>
         <w:pStyle w:val="Heading2"/>
@@ -5577,7 +6500,7 @@
           <w:numId w:val="1002"/>
         </w:numPr>
       </w:pPr>
-      <w:hyperlink r:id="rId33">
+      <w:hyperlink r:id="rId34">
         <w:r>
           <w:rPr>
             <w:rStyle w:val="Hyperlink"/>
@@ -5594,7 +6517,7 @@
           <w:numId w:val="1002"/>
         </w:numPr>
       </w:pPr>
-      <w:hyperlink r:id="rId34">
+      <w:hyperlink r:id="rId35">
         <w:r>
           <w:rPr>
             <w:rStyle w:val="Hyperlink"/>
@@ -5611,7 +6534,7 @@
           <w:numId w:val="1002"/>
         </w:numPr>
       </w:pPr>
-      <w:hyperlink r:id="rId35">
+      <w:hyperlink r:id="rId36">
         <w:r>
           <w:rPr>
             <w:rStyle w:val="Hyperlink"/>
@@ -5628,7 +6551,7 @@
           <w:numId w:val="1002"/>
         </w:numPr>
       </w:pPr>
-      <w:hyperlink r:id="rId36">
+      <w:hyperlink r:id="rId37">
         <w:r>
           <w:rPr>
             <w:rStyle w:val="Hyperlink"/>
@@ -5656,7 +6579,7 @@
         <w:t xml:space="preserve">This post demonstrates practical applications of open-source geospatial tools for transportation planning and data visualization. All code is available for adaptation to your own projects and use cases.</w:t>
       </w:r>
     </w:p>
-    <w:bookmarkEnd w:id="37"/>
+    <w:bookmarkEnd w:id="38"/>
     <w:sectPr>
       <w:footnotePr>
         <w:numRestart w:val="eachSect"/>

</xml_diff>

<commit_message>
import app.R using include shortcode
</commit_message>
<xml_diff>
--- a/docs/posts/storymap_my_journey/index.docx
+++ b/docs/posts/storymap_my_journey/index.docx
@@ -273,10 +273,7 @@
         <w:rPr>
           <w:rStyle w:val="VerbatimChar"/>
         </w:rPr>
-        <w:t xml:space="preserve"># source("app.R")</w:t>
-      </w:r>
-      <w:r>
-        <w:br/>
+        <w:t xml:space="preserve">## file: app.R</w:t>
       </w:r>
       <w:r>
         <w:br/>
@@ -3274,7 +3271,7 @@
         <w:rPr>
           <w:rStyle w:val="NormalTok"/>
         </w:rPr>
-        <w:t xml:space="preserve">             </w:t>
+        <w:t xml:space="preserve">                    </w:t>
       </w:r>
       <w:r>
         <w:rPr>
@@ -3307,7 +3304,7 @@
         <w:rPr>
           <w:rStyle w:val="NormalTok"/>
         </w:rPr>
-        <w:t xml:space="preserve">             </w:t>
+        <w:t xml:space="preserve">                    </w:t>
       </w:r>
       <w:r>
         <w:rPr>
@@ -3340,7 +3337,7 @@
         <w:rPr>
           <w:rStyle w:val="NormalTok"/>
         </w:rPr>
-        <w:t xml:space="preserve">             </w:t>
+        <w:t xml:space="preserve">                    </w:t>
       </w:r>
       <w:r>
         <w:rPr>
@@ -3421,6 +3418,288 @@
         <w:rPr>
           <w:rStyle w:val="StringTok"/>
         </w:rPr>
+        <w:t xml:space="preserve">"bachelors"</w:t>
+      </w:r>
+      <w:r>
+        <w:rPr>
+          <w:rStyle w:val="NormalTok"/>
+        </w:rPr>
+        <w:t xml:space="preserve">, {</w:t>
+      </w:r>
+      <w:r>
+        <w:br/>
+      </w:r>
+      <w:r>
+        <w:rPr>
+          <w:rStyle w:val="NormalTok"/>
+        </w:rPr>
+        <w:t xml:space="preserve">    mapgl</w:t>
+      </w:r>
+      <w:r>
+        <w:rPr>
+          <w:rStyle w:val="SpecialCharTok"/>
+        </w:rPr>
+        <w:t xml:space="preserve">::</w:t>
+      </w:r>
+      <w:r>
+        <w:rPr>
+          <w:rStyle w:val="FunctionTok"/>
+        </w:rPr>
+        <w:t xml:space="preserve">maplibre_proxy</w:t>
+      </w:r>
+      <w:r>
+        <w:rPr>
+          <w:rStyle w:val="NormalTok"/>
+        </w:rPr>
+        <w:t xml:space="preserve">(</w:t>
+      </w:r>
+      <w:r>
+        <w:rPr>
+          <w:rStyle w:val="StringTok"/>
+        </w:rPr>
+        <w:t xml:space="preserve">"map"</w:t>
+      </w:r>
+      <w:r>
+        <w:rPr>
+          <w:rStyle w:val="NormalTok"/>
+        </w:rPr>
+        <w:t xml:space="preserve">) </w:t>
+      </w:r>
+      <w:r>
+        <w:rPr>
+          <w:rStyle w:val="SpecialCharTok"/>
+        </w:rPr>
+        <w:t xml:space="preserve">|&gt;</w:t>
+      </w:r>
+      <w:r>
+        <w:br/>
+      </w:r>
+      <w:r>
+        <w:rPr>
+          <w:rStyle w:val="NormalTok"/>
+        </w:rPr>
+        <w:t xml:space="preserve">      mapgl</w:t>
+      </w:r>
+      <w:r>
+        <w:rPr>
+          <w:rStyle w:val="SpecialCharTok"/>
+        </w:rPr>
+        <w:t xml:space="preserve">::</w:t>
+      </w:r>
+      <w:r>
+        <w:rPr>
+          <w:rStyle w:val="FunctionTok"/>
+        </w:rPr>
+        <w:t xml:space="preserve">fly_to</w:t>
+      </w:r>
+      <w:r>
+        <w:rPr>
+          <w:rStyle w:val="NormalTok"/>
+        </w:rPr>
+        <w:t xml:space="preserve">(</w:t>
+      </w:r>
+      <w:r>
+        <w:rPr>
+          <w:rStyle w:val="AttributeTok"/>
+        </w:rPr>
+        <w:t xml:space="preserve">center =</w:t>
+      </w:r>
+      <w:r>
+        <w:rPr>
+          <w:rStyle w:val="NormalTok"/>
+        </w:rPr>
+        <w:t xml:space="preserve"> </w:t>
+      </w:r>
+      <w:r>
+        <w:rPr>
+          <w:rStyle w:val="FunctionTok"/>
+        </w:rPr>
+        <w:t xml:space="preserve">c</w:t>
+      </w:r>
+      <w:r>
+        <w:rPr>
+          <w:rStyle w:val="NormalTok"/>
+        </w:rPr>
+        <w:t xml:space="preserve">(</w:t>
+      </w:r>
+      <w:r>
+        <w:rPr>
+          <w:rStyle w:val="FloatTok"/>
+        </w:rPr>
+        <w:t xml:space="preserve">85.31840215760691</w:t>
+      </w:r>
+      <w:r>
+        <w:rPr>
+          <w:rStyle w:val="NormalTok"/>
+        </w:rPr>
+        <w:t xml:space="preserve">, </w:t>
+      </w:r>
+      <w:r>
+        <w:rPr>
+          <w:rStyle w:val="FloatTok"/>
+        </w:rPr>
+        <w:t xml:space="preserve">27.681136558618093</w:t>
+      </w:r>
+      <w:r>
+        <w:rPr>
+          <w:rStyle w:val="NormalTok"/>
+        </w:rPr>
+        <w:t xml:space="preserve">),</w:t>
+      </w:r>
+      <w:r>
+        <w:br/>
+      </w:r>
+      <w:r>
+        <w:rPr>
+          <w:rStyle w:val="NormalTok"/>
+        </w:rPr>
+        <w:t xml:space="preserve">                    </w:t>
+      </w:r>
+      <w:r>
+        <w:rPr>
+          <w:rStyle w:val="AttributeTok"/>
+        </w:rPr>
+        <w:t xml:space="preserve">zoom =</w:t>
+      </w:r>
+      <w:r>
+        <w:rPr>
+          <w:rStyle w:val="NormalTok"/>
+        </w:rPr>
+        <w:t xml:space="preserve"> </w:t>
+      </w:r>
+      <w:r>
+        <w:rPr>
+          <w:rStyle w:val="DecValTok"/>
+        </w:rPr>
+        <w:t xml:space="preserve">16</w:t>
+      </w:r>
+      <w:r>
+        <w:rPr>
+          <w:rStyle w:val="NormalTok"/>
+        </w:rPr>
+        <w:t xml:space="preserve">,</w:t>
+      </w:r>
+      <w:r>
+        <w:br/>
+      </w:r>
+      <w:r>
+        <w:rPr>
+          <w:rStyle w:val="NormalTok"/>
+        </w:rPr>
+        <w:t xml:space="preserve">                    </w:t>
+      </w:r>
+      <w:r>
+        <w:rPr>
+          <w:rStyle w:val="AttributeTok"/>
+        </w:rPr>
+        <w:t xml:space="preserve">pitch =</w:t>
+      </w:r>
+      <w:r>
+        <w:rPr>
+          <w:rStyle w:val="NormalTok"/>
+        </w:rPr>
+        <w:t xml:space="preserve"> </w:t>
+      </w:r>
+      <w:r>
+        <w:rPr>
+          <w:rStyle w:val="DecValTok"/>
+        </w:rPr>
+        <w:t xml:space="preserve">49</w:t>
+      </w:r>
+      <w:r>
+        <w:rPr>
+          <w:rStyle w:val="NormalTok"/>
+        </w:rPr>
+        <w:t xml:space="preserve">,</w:t>
+      </w:r>
+      <w:r>
+        <w:br/>
+      </w:r>
+      <w:r>
+        <w:rPr>
+          <w:rStyle w:val="NormalTok"/>
+        </w:rPr>
+        <w:t xml:space="preserve">                    </w:t>
+      </w:r>
+      <w:r>
+        <w:rPr>
+          <w:rStyle w:val="AttributeTok"/>
+        </w:rPr>
+        <w:t xml:space="preserve">bearing =</w:t>
+      </w:r>
+      <w:r>
+        <w:rPr>
+          <w:rStyle w:val="NormalTok"/>
+        </w:rPr>
+        <w:t xml:space="preserve"> </w:t>
+      </w:r>
+      <w:r>
+        <w:rPr>
+          <w:rStyle w:val="FloatTok"/>
+        </w:rPr>
+        <w:t xml:space="preserve">12.8</w:t>
+      </w:r>
+      <w:r>
+        <w:rPr>
+          <w:rStyle w:val="NormalTok"/>
+        </w:rPr>
+        <w:t xml:space="preserve">)</w:t>
+      </w:r>
+      <w:r>
+        <w:br/>
+      </w:r>
+      <w:r>
+        <w:rPr>
+          <w:rStyle w:val="NormalTok"/>
+        </w:rPr>
+        <w:t xml:space="preserve">  })</w:t>
+      </w:r>
+      <w:r>
+        <w:br/>
+      </w:r>
+      <w:r>
+        <w:br/>
+      </w:r>
+      <w:r>
+        <w:rPr>
+          <w:rStyle w:val="NormalTok"/>
+        </w:rPr>
+        <w:t xml:space="preserve">  mapgl</w:t>
+      </w:r>
+      <w:r>
+        <w:rPr>
+          <w:rStyle w:val="SpecialCharTok"/>
+        </w:rPr>
+        <w:t xml:space="preserve">::</w:t>
+      </w:r>
+      <w:r>
+        <w:rPr>
+          <w:rStyle w:val="FunctionTok"/>
+        </w:rPr>
+        <w:t xml:space="preserve">on_section</w:t>
+      </w:r>
+      <w:r>
+        <w:rPr>
+          <w:rStyle w:val="NormalTok"/>
+        </w:rPr>
+        <w:t xml:space="preserve">(</w:t>
+      </w:r>
+      <w:r>
+        <w:rPr>
+          <w:rStyle w:val="StringTok"/>
+        </w:rPr>
+        <w:t xml:space="preserve">"map"</w:t>
+      </w:r>
+      <w:r>
+        <w:rPr>
+          <w:rStyle w:val="NormalTok"/>
+        </w:rPr>
+        <w:t xml:space="preserve">, </w:t>
+      </w:r>
+      <w:r>
+        <w:rPr>
+          <w:rStyle w:val="StringTok"/>
+        </w:rPr>
         <w:t xml:space="preserve">"masters"</w:t>
       </w:r>
       <w:r>
@@ -3562,7 +3841,7 @@
         <w:rPr>
           <w:rStyle w:val="NormalTok"/>
         </w:rPr>
-        <w:t xml:space="preserve">             </w:t>
+        <w:t xml:space="preserve">                    </w:t>
       </w:r>
       <w:r>
         <w:rPr>
@@ -3595,7 +3874,7 @@
         <w:rPr>
           <w:rStyle w:val="NormalTok"/>
         </w:rPr>
-        <w:t xml:space="preserve">             </w:t>
+        <w:t xml:space="preserve">                    </w:t>
       </w:r>
       <w:r>
         <w:rPr>
@@ -3628,7 +3907,7 @@
         <w:rPr>
           <w:rStyle w:val="NormalTok"/>
         </w:rPr>
-        <w:t xml:space="preserve">             </w:t>
+        <w:t xml:space="preserve">                    </w:t>
       </w:r>
       <w:r>
         <w:rPr>
@@ -3850,7 +4129,7 @@
         <w:rPr>
           <w:rStyle w:val="NormalTok"/>
         </w:rPr>
-        <w:t xml:space="preserve">             </w:t>
+        <w:t xml:space="preserve">                    </w:t>
       </w:r>
       <w:r>
         <w:rPr>
@@ -3883,7 +4162,7 @@
         <w:rPr>
           <w:rStyle w:val="NormalTok"/>
         </w:rPr>
-        <w:t xml:space="preserve">             </w:t>
+        <w:t xml:space="preserve">                    </w:t>
       </w:r>
       <w:r>
         <w:rPr>
@@ -3916,7 +4195,7 @@
         <w:rPr>
           <w:rStyle w:val="NormalTok"/>
         </w:rPr>
-        <w:t xml:space="preserve">             </w:t>
+        <w:t xml:space="preserve">                    </w:t>
       </w:r>
       <w:r>
         <w:rPr>
@@ -4138,7 +4417,7 @@
         <w:rPr>
           <w:rStyle w:val="NormalTok"/>
         </w:rPr>
-        <w:t xml:space="preserve">             </w:t>
+        <w:t xml:space="preserve">                    </w:t>
       </w:r>
       <w:r>
         <w:rPr>
@@ -4171,7 +4450,7 @@
         <w:rPr>
           <w:rStyle w:val="NormalTok"/>
         </w:rPr>
-        <w:t xml:space="preserve">             </w:t>
+        <w:t xml:space="preserve">                    </w:t>
       </w:r>
       <w:r>
         <w:rPr>
@@ -4204,7 +4483,7 @@
         <w:rPr>
           <w:rStyle w:val="NormalTok"/>
         </w:rPr>
-        <w:t xml:space="preserve">             </w:t>
+        <w:t xml:space="preserve">                    </w:t>
       </w:r>
       <w:r>
         <w:rPr>
@@ -4448,7 +4727,7 @@
         <w:pStyle w:val="DefinitionTerm"/>
       </w:pPr>
       <w:r>
-        <w:t xml:space="preserve">Line 100</w:t>
+        <w:t xml:space="preserve">Line 108</w:t>
       </w:r>
     </w:p>
     <w:p>

</xml_diff>

<commit_message>
Removed "aspiring" from homepage and about page
</commit_message>
<xml_diff>
--- a/docs/posts/storymap_my_journey/index.docx
+++ b/docs/posts/storymap_my_journey/index.docx
@@ -262,6 +262,27 @@
           <w:rStyle w:val="VerbatimChar"/>
         </w:rPr>
         <w:t xml:space="preserve">#| viewerHeight: 600</w:t>
+      </w:r>
+      <w:r>
+        <w:br/>
+      </w:r>
+      <w:r>
+        <w:br/>
+      </w:r>
+      <w:r>
+        <w:rPr>
+          <w:rStyle w:val="VerbatimChar"/>
+        </w:rPr>
+        <w:t xml:space="preserve"># Install mapgl from Kyle Walker's r-universe</w:t>
+      </w:r>
+      <w:r>
+        <w:br/>
+      </w:r>
+      <w:r>
+        <w:rPr>
+          <w:rStyle w:val="VerbatimChar"/>
+        </w:rPr>
+        <w:t xml:space="preserve"># webr::install("mapgl", repos = "https://walkerke.r-universe.dev/")</w:t>
       </w:r>
       <w:r>
         <w:br/>

</xml_diff>

<commit_message>
Add note to the mapgl error in storymap
</commit_message>
<xml_diff>
--- a/docs/posts/storymap_my_journey/index.docx
+++ b/docs/posts/storymap_my_journey/index.docx
@@ -199,7 +199,7 @@
       </w:r>
     </w:p>
     <w:bookmarkEnd w:id="21"/>
-    <w:bookmarkStart w:id="23" w:name="interactive-storymap-demo"/>
+    <w:bookmarkStart w:id="26" w:name="interactive-storymap-demo"/>
     <w:p>
       <w:pPr>
         <w:pStyle w:val="Heading2"/>
@@ -216,7 +216,214 @@
         <w:t xml:space="preserve">Below is the complete interactive storymap. You can scroll through the different sections to see how the map smoothly transitions between locations, each representing a significant milestone in my journey.</w:t>
       </w:r>
     </w:p>
-    <w:bookmarkStart w:id="22" w:name="annotated-cell-1"/>
+    <w:tbl>
+      <w:tblPr>
+        <w:tblStyle w:val="Table"/>
+        <w:tblLook w:firstRow="0" w:lastRow="0" w:firstColumn="0" w:lastColumn="0" w:noHBand="0" w:noVBand="0" w:val="0000"/>
+        <w:tblBorders>
+          <w:left w:val="single" w:sz="24" w:space="0" w:color="0758E5"/>
+          <w:right w:val="single" w:sz="4" w:space="0" w:color="0758E5"/>
+          <w:top w:val="single" w:sz="4" w:space="0" w:color="0758E5"/>
+          <w:bottom w:val="single" w:sz="4" w:space="0" w:color="0758E5"/>
+        </w:tblBorders>
+        <w:tblCellMar>
+          <w:left w:w="144" w:type="dxa"/>
+          <w:right w:w="144" w:type="dxa"/>
+        </w:tblCellMar>
+        <w:tblInd w:w="164" w:type="dxa"/>
+        <w:tblW w:type="pct" w:w="100%"/>
+      </w:tblPr>
+      <w:tr>
+        <w:trPr>
+          <w:cantSplit/>
+        </w:trPr>
+        <w:tc>
+          <w:tcPr>
+            <w:shd w:color="auto" w:fill="dae6fb" w:val="clear"/>
+            <w:tcMar>
+              <w:top w:w="92" w:type="dxa"/>
+              <w:bottom w:w="92" w:type="dxa"/>
+            </w:tcMar>
+          </w:tcPr>
+          <w:p>
+            <w:pPr>
+              <w:pStyle w:val="BodyText"/>
+            </w:pPr>
+            <w:pPr>
+              <w:spacing w:before="0" w:after="0"/>
+              <w:textAlignment w:val="center"/>
+            </w:pPr>
+            <w:r>
+              <w:drawing>
+                <wp:inline>
+                  <wp:extent cx="152400" cy="152400"/>
+                  <wp:effectExtent b="0" l="0" r="0" t="0"/>
+                  <wp:docPr descr="" title="" id="23" name="Picture"/>
+                  <a:graphic>
+                    <a:graphicData uri="http://schemas.openxmlformats.org/drawingml/2006/picture">
+                      <pic:pic>
+                        <pic:nvPicPr>
+                          <pic:cNvPr descr="C:\Program Files\Quarto\share\formats\docx\note.png" id="24" name="Picture"/>
+                          <pic:cNvPicPr>
+                            <a:picLocks noChangeArrowheads="1" noChangeAspect="1"/>
+                          </pic:cNvPicPr>
+                        </pic:nvPicPr>
+                        <pic:blipFill>
+                          <a:blip r:embed="rId22"/>
+                          <a:stretch>
+                            <a:fillRect/>
+                          </a:stretch>
+                        </pic:blipFill>
+                        <pic:spPr bwMode="auto">
+                          <a:xfrm>
+                            <a:off x="0" y="0"/>
+                            <a:ext cx="152400" cy="152400"/>
+                          </a:xfrm>
+                          <a:prstGeom prst="rect">
+                            <a:avLst/>
+                          </a:prstGeom>
+                          <a:noFill/>
+                          <a:ln w="9525">
+                            <a:noFill/>
+                            <a:headEnd/>
+                            <a:tailEnd/>
+                          </a:ln>
+                        </pic:spPr>
+                      </pic:pic>
+                    </a:graphicData>
+                  </a:graphic>
+                </wp:inline>
+              </w:drawing>
+            </w:r>
+            <w:r>
+              <w:t xml:space="preserve"> </w:t>
+            </w:r>
+            <w:r>
+              <w:t xml:space="preserve"> </w:t>
+            </w:r>
+            <w:r>
+              <w:t xml:space="preserve">Note</w:t>
+            </w:r>
+          </w:p>
+        </w:tc>
+      </w:tr>
+      <w:tr>
+        <w:trPr>
+          <w:cantSplit/>
+        </w:trPr>
+        <w:tc>
+          <w:tcPr>
+            <w:tcMar>
+              <w:top w:w="108" w:type="dxa"/>
+              <w:bottom w:w="108" w:type="dxa"/>
+            </w:tcMar>
+          </w:tcPr>
+          <w:p>
+            <w:pPr>
+              <w:pStyle w:val="BodyText"/>
+            </w:pPr>
+            <w:pPr>
+              <w:spacing w:before="16"/>
+            </w:pPr>
+            <w:r>
+              <w:t xml:space="preserve">The</w:t>
+            </w:r>
+            <w:r>
+              <w:t xml:space="preserve"> </w:t>
+            </w:r>
+            <w:r>
+              <w:rPr>
+                <w:rStyle w:val="VerbatimChar"/>
+              </w:rPr>
+              <w:t xml:space="preserve">add_globe_control()</w:t>
+            </w:r>
+            <w:r>
+              <w:t xml:space="preserve"> </w:t>
+            </w:r>
+            <w:r>
+              <w:t xml:space="preserve">function isn’t working because it’s only available in</w:t>
+            </w:r>
+            <w:r>
+              <w:t xml:space="preserve"> </w:t>
+            </w:r>
+            <w:r>
+              <w:rPr>
+                <w:rStyle w:val="VerbatimChar"/>
+              </w:rPr>
+              <w:t xml:space="preserve">mapgl</w:t>
+            </w:r>
+            <w:r>
+              <w:t xml:space="preserve"> </w:t>
+            </w:r>
+            <w:r>
+              <w:t xml:space="preserve">version 0.2.2 and higher. The version on CRAN is 0.4.0, while the one on</w:t>
+            </w:r>
+            <w:r>
+              <w:t xml:space="preserve"> </w:t>
+            </w:r>
+            <w:r>
+              <w:rPr>
+                <w:rStyle w:val="VerbatimChar"/>
+              </w:rPr>
+              <w:t xml:space="preserve">repo.r-wasm.org</w:t>
+            </w:r>
+            <w:r>
+              <w:t xml:space="preserve"> </w:t>
+            </w:r>
+            <w:r>
+              <w:t xml:space="preserve">is still 0.2.1.</w:t>
+            </w:r>
+          </w:p>
+          <w:p>
+            <w:pPr>
+              <w:pStyle w:val="BodyText"/>
+            </w:pPr>
+            <w:pPr>
+              <w:spacing w:after="16"/>
+            </w:pPr>
+            <w:r>
+              <w:t xml:space="preserve">Once</w:t>
+            </w:r>
+            <w:r>
+              <w:t xml:space="preserve"> </w:t>
+            </w:r>
+            <w:r>
+              <w:rPr>
+                <w:rStyle w:val="VerbatimChar"/>
+              </w:rPr>
+              <w:t xml:space="preserve">mapgl</w:t>
+            </w:r>
+            <w:r>
+              <w:t xml:space="preserve"> </w:t>
+            </w:r>
+            <w:r>
+              <w:t xml:space="preserve">is updated on</w:t>
+            </w:r>
+            <w:r>
+              <w:t xml:space="preserve"> </w:t>
+            </w:r>
+            <w:r>
+              <w:rPr>
+                <w:rStyle w:val="VerbatimChar"/>
+              </w:rPr>
+              <w:t xml:space="preserve">repo.r-wasm.org</w:t>
+            </w:r>
+            <w:r>
+              <w:t xml:space="preserve">, this storymap will work as expected. Thank you for your understanding!</w:t>
+            </w:r>
+          </w:p>
+        </w:tc>
+      </w:tr>
+    </w:tbl>
+    <w:p>
+      <w:pPr>
+        <w:pStyle w:val="BodyText"/>
+      </w:pPr>
+      <w:r>
+        <w:t xml:space="preserve"> </w:t>
+      </w:r>
+    </w:p>
+    <w:bookmarkStart w:id="25" w:name="annotated-cell-1"/>
     <w:p>
       <w:pPr>
         <w:pStyle w:val="SourceCode"/>
@@ -1215,9 +1422,9 @@
         <w:t xml:space="preserve">shiny::shinyApp(ui, server)</w:t>
       </w:r>
     </w:p>
-    <w:bookmarkEnd w:id="22"/>
-    <w:bookmarkEnd w:id="23"/>
-    <w:bookmarkStart w:id="25" w:name="source-code"/>
+    <w:bookmarkEnd w:id="25"/>
+    <w:bookmarkEnd w:id="26"/>
+    <w:bookmarkStart w:id="28" w:name="source-code"/>
     <w:p>
       <w:pPr>
         <w:pStyle w:val="Heading2"/>
@@ -1234,7 +1441,7 @@
         <w:t xml:space="preserve">The storymap application follows a typical Shiny structure with some specialized {mapgl} components. Following is the source code for this dashboard (Please click on the numbers on the far right for additional explanation of syntax and mechanics):</w:t>
       </w:r>
     </w:p>
-    <w:bookmarkStart w:id="24" w:name="annotated-cell-2"/>
+    <w:bookmarkStart w:id="27" w:name="annotated-cell-2"/>
     <w:p>
       <w:pPr>
         <w:pStyle w:val="SourceCode"/>
@@ -4579,7 +4786,7 @@
         <w:t xml:space="preserve">(ui, server)</w:t>
       </w:r>
     </w:p>
-    <w:bookmarkEnd w:id="24"/>
+    <w:bookmarkEnd w:id="27"/>
     <w:p>
       <w:pPr>
         <w:pStyle w:val="DefinitionTerm"/>
@@ -4759,8 +4966,8 @@
         <w:t xml:space="preserve">Launch the Shiny application combining UI and server components</w:t>
       </w:r>
     </w:p>
-    <w:bookmarkEnd w:id="25"/>
-    <w:bookmarkStart w:id="32" w:name="understanding-the-app-structure"/>
+    <w:bookmarkEnd w:id="28"/>
+    <w:bookmarkStart w:id="35" w:name="understanding-the-app-structure"/>
     <w:p>
       <w:pPr>
         <w:pStyle w:val="Heading2"/>
@@ -4769,7 +4976,7 @@
         <w:t xml:space="preserve">5 Understanding the App Structure</w:t>
       </w:r>
     </w:p>
-    <w:bookmarkStart w:id="27" w:name="setting-up-the-user-interface"/>
+    <w:bookmarkStart w:id="30" w:name="setting-up-the-user-interface"/>
     <w:p>
       <w:pPr>
         <w:pStyle w:val="Heading3"/>
@@ -4778,7 +4985,7 @@
         <w:t xml:space="preserve">Setting Up the User Interface</w:t>
       </w:r>
     </w:p>
-    <w:bookmarkStart w:id="26" w:name="annotated-cell-3"/>
+    <w:bookmarkStart w:id="29" w:name="annotated-cell-3"/>
     <w:p>
       <w:pPr>
         <w:pStyle w:val="SourceCode"/>
@@ -5378,7 +5585,7 @@
         <w:t xml:space="preserve">)</w:t>
       </w:r>
     </w:p>
-    <w:bookmarkEnd w:id="26"/>
+    <w:bookmarkEnd w:id="29"/>
     <w:p>
       <w:pPr>
         <w:pStyle w:val="DefinitionTerm"/>
@@ -5540,8 +5747,8 @@
         <w:t xml:space="preserve">: Using MapLibre GL JS for performant vector tile rendering</w:t>
       </w:r>
     </w:p>
-    <w:bookmarkEnd w:id="27"/>
-    <w:bookmarkStart w:id="29" w:name="configuring-the-map"/>
+    <w:bookmarkEnd w:id="30"/>
+    <w:bookmarkStart w:id="32" w:name="configuring-the-map"/>
     <w:p>
       <w:pPr>
         <w:pStyle w:val="Heading3"/>
@@ -5550,7 +5757,7 @@
         <w:t xml:space="preserve">Configuring the Map</w:t>
       </w:r>
     </w:p>
-    <w:bookmarkStart w:id="28" w:name="annotated-cell-4"/>
+    <w:bookmarkStart w:id="31" w:name="annotated-cell-4"/>
     <w:p>
       <w:pPr>
         <w:pStyle w:val="SourceCode"/>
@@ -6045,7 +6252,7 @@
         <w:t xml:space="preserve">}</w:t>
       </w:r>
     </w:p>
-    <w:bookmarkEnd w:id="28"/>
+    <w:bookmarkEnd w:id="31"/>
     <w:p>
       <w:pPr>
         <w:pStyle w:val="DefinitionTerm"/>
@@ -6253,8 +6460,8 @@
         <w:t xml:space="preserve">: Provides geographic context when zoomed in on specific locations</w:t>
       </w:r>
     </w:p>
-    <w:bookmarkEnd w:id="29"/>
-    <w:bookmarkStart w:id="31" w:name="implementing-section-behaviors"/>
+    <w:bookmarkEnd w:id="32"/>
+    <w:bookmarkStart w:id="34" w:name="implementing-section-behaviors"/>
     <w:p>
       <w:pPr>
         <w:pStyle w:val="Heading3"/>
@@ -6263,7 +6470,7 @@
         <w:t xml:space="preserve">Implementing Section Behaviors</w:t>
       </w:r>
     </w:p>
-    <w:bookmarkStart w:id="30" w:name="annotated-cell-5"/>
+    <w:bookmarkStart w:id="33" w:name="annotated-cell-5"/>
     <w:p>
       <w:pPr>
         <w:pStyle w:val="SourceCode"/>
@@ -6566,7 +6773,7 @@
         <w:t xml:space="preserve">})</w:t>
       </w:r>
     </w:p>
-    <w:bookmarkEnd w:id="30"/>
+    <w:bookmarkEnd w:id="33"/>
     <w:p>
       <w:pPr>
         <w:pStyle w:val="DefinitionTerm"/>
@@ -6755,9 +6962,9 @@
         <w:t xml:space="preserve">: Oriented to show the location from the most informative angle</w:t>
       </w:r>
     </w:p>
-    <w:bookmarkEnd w:id="31"/>
-    <w:bookmarkEnd w:id="32"/>
-    <w:bookmarkStart w:id="33" w:name="conclusion"/>
+    <w:bookmarkEnd w:id="34"/>
+    <w:bookmarkEnd w:id="35"/>
+    <w:bookmarkStart w:id="36" w:name="conclusion"/>
     <w:p>
       <w:pPr>
         <w:pStyle w:val="Heading2"/>
@@ -6782,8 +6989,8 @@
         <w:t xml:space="preserve">The combination of R’s data processing capabilities with modern web mapping technology creates opportunities for innovative visualization approaches that can enhance public engagement and decision-making processes in transportation planning and urban analytics.</w:t>
       </w:r>
     </w:p>
-    <w:bookmarkEnd w:id="33"/>
-    <w:bookmarkStart w:id="38" w:name="additional-resources"/>
+    <w:bookmarkEnd w:id="36"/>
+    <w:bookmarkStart w:id="41" w:name="additional-resources"/>
     <w:p>
       <w:pPr>
         <w:pStyle w:val="Heading2"/>
@@ -6800,7 +7007,7 @@
           <w:numId w:val="1002"/>
         </w:numPr>
       </w:pPr>
-      <w:hyperlink r:id="rId34">
+      <w:hyperlink r:id="rId37">
         <w:r>
           <w:rPr>
             <w:rStyle w:val="Hyperlink"/>
@@ -6817,7 +7024,7 @@
           <w:numId w:val="1002"/>
         </w:numPr>
       </w:pPr>
-      <w:hyperlink r:id="rId35">
+      <w:hyperlink r:id="rId38">
         <w:r>
           <w:rPr>
             <w:rStyle w:val="Hyperlink"/>
@@ -6834,7 +7041,7 @@
           <w:numId w:val="1002"/>
         </w:numPr>
       </w:pPr>
-      <w:hyperlink r:id="rId36">
+      <w:hyperlink r:id="rId39">
         <w:r>
           <w:rPr>
             <w:rStyle w:val="Hyperlink"/>
@@ -6851,7 +7058,7 @@
           <w:numId w:val="1002"/>
         </w:numPr>
       </w:pPr>
-      <w:hyperlink r:id="rId37">
+      <w:hyperlink r:id="rId40">
         <w:r>
           <w:rPr>
             <w:rStyle w:val="Hyperlink"/>
@@ -6879,7 +7086,7 @@
         <w:t xml:space="preserve">This post demonstrates practical applications of open-source geospatial tools for transportation planning and data visualization. All code is available for adaptation to your own projects and use cases.</w:t>
       </w:r>
     </w:p>
-    <w:bookmarkEnd w:id="38"/>
+    <w:bookmarkEnd w:id="41"/>
     <w:sectPr>
       <w:footnotePr>
         <w:numRestart w:val="eachSect"/>

</xml_diff>

<commit_message>
add webr installation of mapgl from walkerke repo
</commit_message>
<xml_diff>
--- a/docs/posts/storymap_my_journey/index.docx
+++ b/docs/posts/storymap_my_journey/index.docx
@@ -489,7 +489,16 @@
         <w:rPr>
           <w:rStyle w:val="VerbatimChar"/>
         </w:rPr>
-        <w:t xml:space="preserve"># webr::install("mapgl", repos = "https://walkerke.r-universe.dev/")</w:t>
+        <w:t xml:space="preserve">webr::install("mapgl", repos = c("https://walkerke.r-universe.dev/", "https://repo.r-wasm.org"))</w:t>
+      </w:r>
+      <w:r>
+        <w:br/>
+      </w:r>
+      <w:r>
+        <w:rPr>
+          <w:rStyle w:val="VerbatimChar"/>
+        </w:rPr>
+        <w:t xml:space="preserve">webr::install("codetools", repos = "https://repo.r-wasm.org")</w:t>
       </w:r>
       <w:r>
         <w:br/>

</xml_diff>

<commit_message>
add tip for shinylive loading time in storymap
</commit_message>
<xml_diff>
--- a/docs/posts/storymap_my_journey/index.docx
+++ b/docs/posts/storymap_my_journey/index.docx
@@ -199,7 +199,7 @@
       </w:r>
     </w:p>
     <w:bookmarkEnd w:id="10"/>
-    <w:bookmarkStart w:id="12" w:name="interactive-storymap-demo"/>
+    <w:bookmarkStart w:id="15" w:name="interactive-storymap-demo"/>
     <w:p>
       <w:pPr>
         <w:pStyle w:val="Heading2"/>
@@ -216,7 +216,146 @@
         <w:t xml:space="preserve">Below is the complete interactive storymap. You can scroll through the different sections to see how the map smoothly transitions between locations, each representing a significant milestone in my journey.</w:t>
       </w:r>
     </w:p>
-    <w:bookmarkStart w:id="11" w:name="annotated-cell-1"/>
+    <w:tbl>
+      <w:tblPr>
+        <w:tblStyle w:val="Table"/>
+        <w:tblLook w:firstRow="0" w:lastRow="0" w:firstColumn="0" w:lastColumn="0" w:noHBand="0" w:noVBand="0" w:val="0000"/>
+        <w:tblBorders>
+          <w:top w:val="single" w:sz="4" w:space="0" w:color="0758E5"/>
+          <w:left w:val="single" w:sz="24" w:space="0" w:color="0758E5"/>
+          <w:bottom w:val="single" w:sz="4" w:space="0" w:color="0758E5"/>
+          <w:right w:val="single" w:sz="4" w:space="0" w:color="0758E5"/>
+        </w:tblBorders>
+        <w:tblCellMar>
+          <w:left w:w="144" w:type="dxa"/>
+          <w:right w:w="144" w:type="dxa"/>
+        </w:tblCellMar>
+        <w:tblLook w:firstRow="0" w:lastRow="0" w:firstColumn="0" w:lastColumn="0" w:noHBand="0" w:noVBand="0" w:val="0000"/>
+      </w:tblPr>
+      <w:tr>
+        <w:trPr>
+          <w:cantSplit/>
+        </w:trPr>
+        <w:tc>
+          <w:tcPr>
+            <w:shd w:color="auto" w:fill="dae6fb" w:val="clear"/>
+            <w:tcMar>
+              <w:top w:w="92" w:type="dxa"/>
+              <w:bottom w:w="92" w:type="dxa"/>
+            </w:tcMar>
+          </w:tcPr>
+          <w:p>
+            <w:pPr>
+              <w:pStyle w:val="BodyText"/>
+            </w:pPr>
+            <w:pPr>
+              <w:spacing w:before="0" w:after="0"/>
+              <w:textAlignment w:val="center"/>
+            </w:pPr>
+            <w:r>
+              <w:drawing>
+                <wp:inline>
+                  <wp:extent cx="152400" cy="152400"/>
+                  <wp:effectExtent b="0" l="0" r="0" t="0"/>
+                  <wp:docPr descr="" title="" id="12" name="Picture"/>
+                  <a:graphic>
+                    <a:graphicData uri="http://schemas.openxmlformats.org/drawingml/2006/picture">
+                      <pic:pic>
+                        <pic:nvPicPr>
+                          <pic:cNvPr descr="C:\Program Files\Quarto\share\formats\docx\note.png" id="13" name="Picture"/>
+                          <pic:cNvPicPr>
+                            <a:picLocks noChangeArrowheads="1" noChangeAspect="1"/>
+                          </pic:cNvPicPr>
+                        </pic:nvPicPr>
+                        <pic:blipFill>
+                          <a:blip r:embed="rId11"/>
+                          <a:stretch>
+                            <a:fillRect/>
+                          </a:stretch>
+                        </pic:blipFill>
+                        <pic:spPr bwMode="auto">
+                          <a:xfrm>
+                            <a:off x="0" y="0"/>
+                            <a:ext cx="152400" cy="152400"/>
+                          </a:xfrm>
+                          <a:prstGeom prst="rect">
+                            <a:avLst/>
+                          </a:prstGeom>
+                          <a:noFill/>
+                          <a:ln w="9525">
+                            <a:noFill/>
+                            <a:headEnd/>
+                            <a:tailEnd/>
+                          </a:ln>
+                        </pic:spPr>
+                      </pic:pic>
+                    </a:graphicData>
+                  </a:graphic>
+                </wp:inline>
+              </w:drawing>
+            </w:r>
+            <w:r>
+              <w:t xml:space="preserve"> </w:t>
+            </w:r>
+            <w:r>
+              <w:t xml:space="preserve"> </w:t>
+            </w:r>
+            <w:r>
+              <w:t xml:space="preserve">Initializing App</w:t>
+            </w:r>
+          </w:p>
+        </w:tc>
+      </w:tr>
+      <w:tr>
+        <w:trPr>
+          <w:cantSplit/>
+        </w:trPr>
+        <w:tc>
+          <w:tcPr>
+            <w:tcMar>
+              <w:top w:w="108" w:type="dxa"/>
+              <w:bottom w:w="108" w:type="dxa"/>
+            </w:tcMar>
+          </w:tcPr>
+          <w:p>
+            <w:pPr>
+              <w:pStyle w:val="BodyText"/>
+            </w:pPr>
+            <w:pPr>
+              <w:spacing w:before="16" w:after="16"/>
+            </w:pPr>
+            <w:r>
+              <w:t xml:space="preserve">Please be patient while the R environment and packages load in your browser. This may take a few seconds to initialize while the</w:t>
+            </w:r>
+            <w:r>
+              <w:t xml:space="preserve"> </w:t>
+            </w:r>
+            <w:r>
+              <w:rPr>
+                <w:rStyle w:val="VerbatimChar"/>
+              </w:rPr>
+              <w:t xml:space="preserve">shinylive</w:t>
+            </w:r>
+            <w:r>
+              <w:t xml:space="preserve"> </w:t>
+            </w:r>
+            <w:r>
+              <w:t xml:space="preserve">components are prepared.</w:t>
+            </w:r>
+          </w:p>
+          <w:p/>
+        </w:tc>
+      </w:tr>
+    </w:tbl>
+    <w:p>
+      <w:pPr>
+        <w:pStyle w:val="BodyText"/>
+      </w:pPr>
+      <w:r>
+        <w:t xml:space="preserve"> </w:t>
+      </w:r>
+    </w:p>
+    <w:bookmarkStart w:id="14" w:name="annotated-cell-1"/>
     <w:p>
       <w:pPr>
         <w:pStyle w:val="SourceCode"/>
@@ -1224,9 +1363,9 @@
         <w:t xml:space="preserve">shiny::shinyApp(ui, server)</w:t>
       </w:r>
     </w:p>
-    <w:bookmarkEnd w:id="11"/>
-    <w:bookmarkEnd w:id="12"/>
-    <w:bookmarkStart w:id="14" w:name="source-code"/>
+    <w:bookmarkEnd w:id="14"/>
+    <w:bookmarkEnd w:id="15"/>
+    <w:bookmarkStart w:id="17" w:name="source-code"/>
     <w:p>
       <w:pPr>
         <w:pStyle w:val="Heading2"/>
@@ -1243,7 +1382,7 @@
         <w:t xml:space="preserve">The storymap application follows a typical Shiny structure with some specialized {mapgl} components. Following is the source code for this dashboard (Please click on the numbers on the far right for additional explanation of syntax and mechanics):</w:t>
       </w:r>
     </w:p>
-    <w:bookmarkStart w:id="13" w:name="annotated-cell-2"/>
+    <w:bookmarkStart w:id="16" w:name="annotated-cell-2"/>
     <w:p>
       <w:pPr>
         <w:pStyle w:val="SourceCode"/>
@@ -4606,7 +4745,7 @@
         <w:t xml:space="preserve">(ui, server)</w:t>
       </w:r>
     </w:p>
-    <w:bookmarkEnd w:id="13"/>
+    <w:bookmarkEnd w:id="16"/>
     <w:p>
       <w:pPr>
         <w:pStyle w:val="DefinitionTerm"/>
@@ -4783,8 +4922,8 @@
         <w:t xml:space="preserve">Launch the Shiny application combining UI and server components</w:t>
       </w:r>
     </w:p>
-    <w:bookmarkEnd w:id="14"/>
-    <w:bookmarkStart w:id="21" w:name="understanding-the-app-structure"/>
+    <w:bookmarkEnd w:id="17"/>
+    <w:bookmarkStart w:id="24" w:name="understanding-the-app-structure"/>
     <w:p>
       <w:pPr>
         <w:pStyle w:val="Heading2"/>
@@ -4793,7 +4932,7 @@
         <w:t xml:space="preserve">5 Understanding the App Structure</w:t>
       </w:r>
     </w:p>
-    <w:bookmarkStart w:id="16" w:name="setting-up-the-user-interface"/>
+    <w:bookmarkStart w:id="19" w:name="setting-up-the-user-interface"/>
     <w:p>
       <w:pPr>
         <w:pStyle w:val="Heading3"/>
@@ -4802,7 +4941,7 @@
         <w:t xml:space="preserve">Setting Up the User Interface</w:t>
       </w:r>
     </w:p>
-    <w:bookmarkStart w:id="15" w:name="annotated-cell-3"/>
+    <w:bookmarkStart w:id="18" w:name="annotated-cell-3"/>
     <w:p>
       <w:pPr>
         <w:pStyle w:val="SourceCode"/>
@@ -5402,7 +5541,7 @@
         <w:t xml:space="preserve">)</w:t>
       </w:r>
     </w:p>
-    <w:bookmarkEnd w:id="15"/>
+    <w:bookmarkEnd w:id="18"/>
     <w:p>
       <w:pPr>
         <w:pStyle w:val="DefinitionTerm"/>
@@ -5564,8 +5703,8 @@
         <w:t xml:space="preserve">: Using MapLibre GL JS for performant vector tile rendering</w:t>
       </w:r>
     </w:p>
-    <w:bookmarkEnd w:id="16"/>
-    <w:bookmarkStart w:id="18" w:name="configuring-the-map"/>
+    <w:bookmarkEnd w:id="19"/>
+    <w:bookmarkStart w:id="21" w:name="configuring-the-map"/>
     <w:p>
       <w:pPr>
         <w:pStyle w:val="Heading3"/>
@@ -5574,7 +5713,7 @@
         <w:t xml:space="preserve">Configuring the Map</w:t>
       </w:r>
     </w:p>
-    <w:bookmarkStart w:id="17" w:name="annotated-cell-4"/>
+    <w:bookmarkStart w:id="20" w:name="annotated-cell-4"/>
     <w:p>
       <w:pPr>
         <w:pStyle w:val="SourceCode"/>
@@ -6087,7 +6226,7 @@
         <w:t xml:space="preserve">}</w:t>
       </w:r>
     </w:p>
-    <w:bookmarkEnd w:id="17"/>
+    <w:bookmarkEnd w:id="20"/>
     <w:p>
       <w:pPr>
         <w:pStyle w:val="DefinitionTerm"/>
@@ -6295,8 +6434,8 @@
         <w:t xml:space="preserve">: Provides geographic context when zoomed in on specific locations</w:t>
       </w:r>
     </w:p>
-    <w:bookmarkEnd w:id="18"/>
-    <w:bookmarkStart w:id="20" w:name="implementing-section-behaviors"/>
+    <w:bookmarkEnd w:id="21"/>
+    <w:bookmarkStart w:id="23" w:name="implementing-section-behaviors"/>
     <w:p>
       <w:pPr>
         <w:pStyle w:val="Heading3"/>
@@ -6305,7 +6444,7 @@
         <w:t xml:space="preserve">Implementing Section Behaviors</w:t>
       </w:r>
     </w:p>
-    <w:bookmarkStart w:id="19" w:name="annotated-cell-5"/>
+    <w:bookmarkStart w:id="22" w:name="annotated-cell-5"/>
     <w:p>
       <w:pPr>
         <w:pStyle w:val="SourceCode"/>
@@ -6608,7 +6747,7 @@
         <w:t xml:space="preserve">})</w:t>
       </w:r>
     </w:p>
-    <w:bookmarkEnd w:id="19"/>
+    <w:bookmarkEnd w:id="22"/>
     <w:p>
       <w:pPr>
         <w:pStyle w:val="DefinitionTerm"/>
@@ -6797,9 +6936,9 @@
         <w:t xml:space="preserve">: Oriented to show the location from the most informative angle</w:t>
       </w:r>
     </w:p>
-    <w:bookmarkEnd w:id="20"/>
-    <w:bookmarkEnd w:id="21"/>
-    <w:bookmarkStart w:id="22" w:name="conclusion"/>
+    <w:bookmarkEnd w:id="23"/>
+    <w:bookmarkEnd w:id="24"/>
+    <w:bookmarkStart w:id="25" w:name="conclusion"/>
     <w:p>
       <w:pPr>
         <w:pStyle w:val="Heading2"/>
@@ -6824,8 +6963,8 @@
         <w:t xml:space="preserve">The combination of R’s data processing capabilities with modern web mapping technology creates opportunities for innovative visualization approaches that can enhance public engagement and decision-making processes in transportation planning and urban analytics.</w:t>
       </w:r>
     </w:p>
-    <w:bookmarkEnd w:id="22"/>
-    <w:bookmarkStart w:id="27" w:name="additional-resources"/>
+    <w:bookmarkEnd w:id="25"/>
+    <w:bookmarkStart w:id="30" w:name="additional-resources"/>
     <w:p>
       <w:pPr>
         <w:pStyle w:val="Heading2"/>
@@ -6842,7 +6981,7 @@
           <w:numId w:val="1002"/>
         </w:numPr>
       </w:pPr>
-      <w:hyperlink r:id="rId23">
+      <w:hyperlink r:id="rId26">
         <w:r>
           <w:rPr>
             <w:rStyle w:val="Hyperlink"/>
@@ -6859,7 +6998,7 @@
           <w:numId w:val="1002"/>
         </w:numPr>
       </w:pPr>
-      <w:hyperlink r:id="rId24">
+      <w:hyperlink r:id="rId27">
         <w:r>
           <w:rPr>
             <w:rStyle w:val="Hyperlink"/>
@@ -6876,7 +7015,7 @@
           <w:numId w:val="1002"/>
         </w:numPr>
       </w:pPr>
-      <w:hyperlink r:id="rId25">
+      <w:hyperlink r:id="rId28">
         <w:r>
           <w:rPr>
             <w:rStyle w:val="Hyperlink"/>
@@ -6893,7 +7032,7 @@
           <w:numId w:val="1002"/>
         </w:numPr>
       </w:pPr>
-      <w:hyperlink r:id="rId26">
+      <w:hyperlink r:id="rId29">
         <w:r>
           <w:rPr>
             <w:rStyle w:val="Hyperlink"/>
@@ -6921,7 +7060,7 @@
         <w:t xml:space="preserve">This post demonstrates practical applications of open-source geospatial tools for transportation planning and data visualization. All code is available for adaptation to your own projects and use cases.</w:t>
       </w:r>
     </w:p>
-    <w:bookmarkEnd w:id="27"/>
+    <w:bookmarkEnd w:id="30"/>
     <w:sectPr>
       <w:footnotePr>
         <w:numRestart w:val="eachSect"/>

</xml_diff>